<commit_message>
liturgy refactoring. feb stubs
</commit_message>
<xml_diff>
--- a/flow/20230914_vu_template/drafts/2025-01-g/01-СР-Обрізання,Василія Великого.docx
+++ b/flow/20230914_vu_template/drafts/2025-01-g/01-СР-Обрізання,Василія Великого.docx
@@ -11093,7 +11093,7 @@
         <w:rPr>
           <w:rFonts w:ascii="Times New Roman" w:hAnsi="Times New Roman"/>
           <w:i/>
-          <w:color w:val="FF4400"/>
+          <w:color w:val="FF0000"/>
           <w:sz w:val="24"/>
         </w:rPr>
         <w:t>Священник:</w:t>
@@ -11103,294 +11103,7 @@
           <w:rFonts w:ascii="Times New Roman" w:hAnsi="Times New Roman"/>
           <w:sz w:val="24"/>
         </w:rPr>
-        <w:t xml:space="preserve"> </w:t>
-      </w:r>
-      <w:r>
-        <w:rPr>
-          <w:rFonts w:ascii="Times New Roman" w:hAnsi="Times New Roman"/>
-          <w:sz w:val="24"/>
-        </w:rPr>
-        <w:t>Бо</w:t>
-      </w:r>
-      <w:r>
-        <w:rPr>
-          <w:rFonts w:ascii="Times New Roman" w:hAnsi="Times New Roman"/>
-          <w:sz w:val="24"/>
-        </w:rPr>
-        <w:t xml:space="preserve"> </w:t>
-      </w:r>
-      <w:r>
-        <w:rPr>
-          <w:rFonts w:ascii="Times New Roman" w:hAnsi="Times New Roman"/>
-          <w:sz w:val="24"/>
-        </w:rPr>
-        <w:t>Тобі</w:t>
-      </w:r>
-      <w:r>
-        <w:rPr>
-          <w:rFonts w:ascii="Times New Roman" w:hAnsi="Times New Roman"/>
-          <w:sz w:val="24"/>
-        </w:rPr>
-        <w:t xml:space="preserve"> </w:t>
-      </w:r>
-      <w:r>
-        <w:rPr>
-          <w:rFonts w:ascii="Times New Roman" w:hAnsi="Times New Roman"/>
-          <w:sz w:val="24"/>
-        </w:rPr>
-        <w:t>належить</w:t>
-      </w:r>
-      <w:r>
-        <w:rPr>
-          <w:rFonts w:ascii="Times New Roman" w:hAnsi="Times New Roman"/>
-          <w:sz w:val="24"/>
-        </w:rPr>
-        <w:t xml:space="preserve"> </w:t>
-      </w:r>
-      <w:r>
-        <w:rPr>
-          <w:rFonts w:ascii="Times New Roman" w:hAnsi="Times New Roman"/>
-          <w:sz w:val="24"/>
-        </w:rPr>
-        <w:t>усяка</w:t>
-      </w:r>
-      <w:r>
-        <w:rPr>
-          <w:rFonts w:ascii="Times New Roman" w:hAnsi="Times New Roman"/>
-          <w:sz w:val="24"/>
-        </w:rPr>
-        <w:t xml:space="preserve"> </w:t>
-      </w:r>
-      <w:r>
-        <w:rPr>
-          <w:rFonts w:ascii="Times New Roman" w:hAnsi="Times New Roman"/>
-          <w:sz w:val="24"/>
-        </w:rPr>
-        <w:t>слава,</w:t>
-      </w:r>
-      <w:r>
-        <w:rPr>
-          <w:rFonts w:ascii="Times New Roman" w:hAnsi="Times New Roman"/>
-          <w:sz w:val="24"/>
-        </w:rPr>
-        <w:t xml:space="preserve"> </w:t>
-      </w:r>
-      <w:r>
-        <w:rPr>
-          <w:rFonts w:ascii="Times New Roman" w:hAnsi="Times New Roman"/>
-          <w:sz w:val="24"/>
-        </w:rPr>
-        <w:t>честь</w:t>
-      </w:r>
-      <w:r>
-        <w:rPr>
-          <w:rFonts w:ascii="Times New Roman" w:hAnsi="Times New Roman"/>
-          <w:sz w:val="24"/>
-        </w:rPr>
-        <w:t xml:space="preserve"> </w:t>
-      </w:r>
-      <w:r>
-        <w:rPr>
-          <w:rFonts w:ascii="Times New Roman" w:hAnsi="Times New Roman"/>
-          <w:sz w:val="24"/>
-        </w:rPr>
-        <w:t>і</w:t>
-      </w:r>
-      <w:r>
-        <w:rPr>
-          <w:rFonts w:ascii="Times New Roman" w:hAnsi="Times New Roman"/>
-          <w:sz w:val="24"/>
-        </w:rPr>
-        <w:t xml:space="preserve"> </w:t>
-      </w:r>
-      <w:r>
-        <w:rPr>
-          <w:rFonts w:ascii="Times New Roman" w:hAnsi="Times New Roman"/>
-          <w:sz w:val="24"/>
-        </w:rPr>
-        <w:t>поклоніння,</w:t>
-      </w:r>
-      <w:r>
-        <w:rPr>
-          <w:rFonts w:ascii="Times New Roman" w:hAnsi="Times New Roman"/>
-          <w:sz w:val="24"/>
-        </w:rPr>
-        <w:t xml:space="preserve"> </w:t>
-      </w:r>
-      <w:r>
-        <w:rPr>
-          <w:rFonts w:ascii="Times New Roman" w:hAnsi="Times New Roman"/>
-          <w:sz w:val="24"/>
-        </w:rPr>
-        <w:t>Отцю,</w:t>
-      </w:r>
-      <w:r>
-        <w:rPr>
-          <w:rFonts w:ascii="Times New Roman" w:hAnsi="Times New Roman"/>
-          <w:sz w:val="24"/>
-        </w:rPr>
-        <w:t xml:space="preserve"> </w:t>
-      </w:r>
-      <w:r>
-        <w:rPr>
-          <w:rFonts w:ascii="Times New Roman" w:hAnsi="Times New Roman"/>
-          <w:sz w:val="24"/>
-        </w:rPr>
-        <w:t>і</w:t>
-      </w:r>
-      <w:r>
-        <w:rPr>
-          <w:rFonts w:ascii="Times New Roman" w:hAnsi="Times New Roman"/>
-          <w:sz w:val="24"/>
-        </w:rPr>
-        <w:t xml:space="preserve"> </w:t>
-      </w:r>
-      <w:r>
-        <w:rPr>
-          <w:rFonts w:ascii="Times New Roman" w:hAnsi="Times New Roman"/>
-          <w:sz w:val="24"/>
-        </w:rPr>
-        <w:t>Сину,</w:t>
-      </w:r>
-      <w:r>
-        <w:rPr>
-          <w:rFonts w:ascii="Times New Roman" w:hAnsi="Times New Roman"/>
-          <w:sz w:val="24"/>
-        </w:rPr>
-        <w:t xml:space="preserve"> </w:t>
-      </w:r>
-      <w:r>
-        <w:rPr>
-          <w:rFonts w:ascii="Times New Roman" w:hAnsi="Times New Roman"/>
-          <w:sz w:val="24"/>
-        </w:rPr>
-        <w:t>і</w:t>
-      </w:r>
-      <w:r>
-        <w:rPr>
-          <w:rFonts w:ascii="Times New Roman" w:hAnsi="Times New Roman"/>
-          <w:sz w:val="24"/>
-        </w:rPr>
-        <w:t xml:space="preserve"> </w:t>
-      </w:r>
-      <w:r>
-        <w:rPr>
-          <w:rFonts w:ascii="Times New Roman" w:hAnsi="Times New Roman"/>
-          <w:sz w:val="24"/>
-        </w:rPr>
-        <w:t>Святому</w:t>
-      </w:r>
-      <w:r>
-        <w:rPr>
-          <w:rFonts w:ascii="Times New Roman" w:hAnsi="Times New Roman"/>
-          <w:sz w:val="24"/>
-        </w:rPr>
-        <w:t xml:space="preserve"> </w:t>
-      </w:r>
-      <w:r>
-        <w:rPr>
-          <w:rFonts w:ascii="Times New Roman" w:hAnsi="Times New Roman"/>
-          <w:sz w:val="24"/>
-        </w:rPr>
-        <w:t>Духові,</w:t>
-      </w:r>
-      <w:r>
-        <w:rPr>
-          <w:rFonts w:ascii="Times New Roman" w:hAnsi="Times New Roman"/>
-          <w:sz w:val="24"/>
-        </w:rPr>
-        <w:t xml:space="preserve"> </w:t>
-      </w:r>
-      <w:r>
-        <w:rPr>
-          <w:rFonts w:ascii="Times New Roman" w:hAnsi="Times New Roman"/>
-          <w:sz w:val="24"/>
-        </w:rPr>
-        <w:t>нині,</w:t>
-      </w:r>
-      <w:r>
-        <w:rPr>
-          <w:rFonts w:ascii="Times New Roman" w:hAnsi="Times New Roman"/>
-          <w:sz w:val="24"/>
-        </w:rPr>
-        <w:t xml:space="preserve"> </w:t>
-      </w:r>
-      <w:r>
-        <w:rPr>
-          <w:rFonts w:ascii="Times New Roman" w:hAnsi="Times New Roman"/>
-          <w:sz w:val="24"/>
-        </w:rPr>
-        <w:t>і</w:t>
-      </w:r>
-      <w:r>
-        <w:rPr>
-          <w:rFonts w:ascii="Times New Roman" w:hAnsi="Times New Roman"/>
-          <w:sz w:val="24"/>
-        </w:rPr>
-        <w:t xml:space="preserve"> </w:t>
-      </w:r>
-      <w:r>
-        <w:rPr>
-          <w:rFonts w:ascii="Times New Roman" w:hAnsi="Times New Roman"/>
-          <w:sz w:val="24"/>
-        </w:rPr>
-        <w:t>повсякчас,</w:t>
-      </w:r>
-      <w:r>
-        <w:rPr>
-          <w:rFonts w:ascii="Times New Roman" w:hAnsi="Times New Roman"/>
-          <w:sz w:val="24"/>
-        </w:rPr>
-        <w:t xml:space="preserve"> </w:t>
-      </w:r>
-      <w:r>
-        <w:rPr>
-          <w:rFonts w:ascii="Times New Roman" w:hAnsi="Times New Roman"/>
-          <w:sz w:val="24"/>
-        </w:rPr>
-        <w:t>і</w:t>
-      </w:r>
-      <w:r>
-        <w:rPr>
-          <w:rFonts w:ascii="Times New Roman" w:hAnsi="Times New Roman"/>
-          <w:sz w:val="24"/>
-        </w:rPr>
-        <w:t xml:space="preserve"> </w:t>
-      </w:r>
-      <w:r>
-        <w:rPr>
-          <w:rFonts w:ascii="Times New Roman" w:hAnsi="Times New Roman"/>
-          <w:sz w:val="24"/>
-        </w:rPr>
-        <w:t>на</w:t>
-      </w:r>
-      <w:r>
-        <w:rPr>
-          <w:rFonts w:ascii="Times New Roman" w:hAnsi="Times New Roman"/>
-          <w:sz w:val="24"/>
-        </w:rPr>
-        <w:t xml:space="preserve"> </w:t>
-      </w:r>
-      <w:r>
-        <w:rPr>
-          <w:rFonts w:ascii="Times New Roman" w:hAnsi="Times New Roman"/>
-          <w:sz w:val="24"/>
-        </w:rPr>
-        <w:t>віки</w:t>
-      </w:r>
-      <w:r>
-        <w:rPr>
-          <w:rFonts w:ascii="Times New Roman" w:hAnsi="Times New Roman"/>
-          <w:sz w:val="24"/>
-        </w:rPr>
-        <w:t xml:space="preserve"> </w:t>
-      </w:r>
-      <w:r>
-        <w:rPr>
-          <w:rFonts w:ascii="Times New Roman" w:hAnsi="Times New Roman"/>
-          <w:sz w:val="24"/>
-        </w:rPr>
-        <w:t>віків.</w:t>
+        <w:t xml:space="preserve"> Бо Тобі належить усяка слава, честь і поклоніння, Отцю, і Сину, і Святому Духові, нині, і повсякчас, і на віки віків.</w:t>
       </w:r>
     </w:p>
     <w:p>
@@ -13956,7 +13669,7 @@
         <w:rPr>
           <w:rFonts w:ascii="Times New Roman" w:hAnsi="Times New Roman"/>
           <w:i/>
-          <w:color w:val="FF4400"/>
+          <w:color w:val="FF0000"/>
           <w:sz w:val="24"/>
         </w:rPr>
         <w:t>Священник:</w:t>
@@ -13964,402 +13677,9 @@
       <w:r>
         <w:rPr>
           <w:rFonts w:ascii="Times New Roman" w:hAnsi="Times New Roman"/>
-          <w:color w:val="000000"/>
-          <w:sz w:val="24"/>
-        </w:rPr>
-        <w:t xml:space="preserve"> </w:t>
-      </w:r>
-      <w:r>
-        <w:rPr>
-          <w:rFonts w:ascii="Times New Roman" w:hAnsi="Times New Roman"/>
-          <w:color w:val="000000"/>
-          <w:sz w:val="24"/>
-        </w:rPr>
-        <w:t>Бо</w:t>
-      </w:r>
-      <w:r>
-        <w:rPr>
-          <w:rFonts w:ascii="Times New Roman" w:hAnsi="Times New Roman"/>
-          <w:color w:val="000000"/>
-          <w:sz w:val="24"/>
-        </w:rPr>
-        <w:t xml:space="preserve"> </w:t>
-      </w:r>
-      <w:r>
-        <w:rPr>
-          <w:rFonts w:ascii="Times New Roman" w:hAnsi="Times New Roman"/>
-          <w:color w:val="000000"/>
-          <w:sz w:val="24"/>
-        </w:rPr>
-        <w:t>Твоя</w:t>
-      </w:r>
-      <w:r>
-        <w:rPr>
-          <w:rFonts w:ascii="Times New Roman" w:hAnsi="Times New Roman"/>
-          <w:color w:val="000000"/>
-          <w:sz w:val="24"/>
-        </w:rPr>
-        <w:t xml:space="preserve"> </w:t>
-      </w:r>
-      <w:r>
-        <w:rPr>
-          <w:rFonts w:ascii="Times New Roman" w:hAnsi="Times New Roman"/>
-          <w:color w:val="000000"/>
-          <w:sz w:val="24"/>
-        </w:rPr>
-        <w:t>є</w:t>
-      </w:r>
-      <w:r>
-        <w:rPr>
-          <w:rFonts w:ascii="Times New Roman" w:hAnsi="Times New Roman"/>
-          <w:color w:val="000000"/>
-          <w:sz w:val="24"/>
-        </w:rPr>
-        <w:t xml:space="preserve"> </w:t>
-      </w:r>
-      <w:r>
-        <w:rPr>
-          <w:rFonts w:ascii="Times New Roman" w:hAnsi="Times New Roman"/>
-          <w:color w:val="000000"/>
-          <w:sz w:val="24"/>
-        </w:rPr>
-        <w:t>влада</w:t>
-      </w:r>
-      <w:r>
-        <w:rPr>
-          <w:rFonts w:ascii="Times New Roman" w:hAnsi="Times New Roman"/>
-          <w:color w:val="000000"/>
-          <w:sz w:val="24"/>
-        </w:rPr>
-        <w:t xml:space="preserve"> </w:t>
-      </w:r>
-      <w:r>
-        <w:rPr>
-          <w:rFonts w:ascii="Times New Roman" w:hAnsi="Times New Roman"/>
-          <w:color w:val="000000"/>
-          <w:sz w:val="24"/>
-        </w:rPr>
-        <w:t>і</w:t>
-      </w:r>
-      <w:r>
-        <w:rPr>
-          <w:rFonts w:ascii="Times New Roman" w:hAnsi="Times New Roman"/>
-          <w:color w:val="000000"/>
-          <w:sz w:val="24"/>
-        </w:rPr>
-        <w:t xml:space="preserve"> </w:t>
-      </w:r>
-      <w:r>
-        <w:rPr>
-          <w:rFonts w:ascii="Times New Roman" w:hAnsi="Times New Roman"/>
-          <w:color w:val="000000"/>
-          <w:sz w:val="24"/>
-        </w:rPr>
-        <w:t>Твоє</w:t>
-      </w:r>
-      <w:r>
-        <w:rPr>
-          <w:rFonts w:ascii="Times New Roman" w:hAnsi="Times New Roman"/>
-          <w:color w:val="000000"/>
-          <w:sz w:val="24"/>
-        </w:rPr>
-        <w:t xml:space="preserve"> </w:t>
-      </w:r>
-      <w:r>
-        <w:rPr>
-          <w:rFonts w:ascii="Times New Roman" w:hAnsi="Times New Roman"/>
-          <w:color w:val="000000"/>
-          <w:sz w:val="24"/>
-        </w:rPr>
-        <w:t>є</w:t>
-      </w:r>
-      <w:r>
-        <w:rPr>
-          <w:rFonts w:ascii="Times New Roman" w:hAnsi="Times New Roman"/>
-          <w:color w:val="000000"/>
-          <w:sz w:val="24"/>
-        </w:rPr>
-        <w:t xml:space="preserve"> </w:t>
-      </w:r>
-      <w:r>
-        <w:rPr>
-          <w:rFonts w:ascii="Times New Roman" w:hAnsi="Times New Roman"/>
-          <w:color w:val="000000"/>
-          <w:sz w:val="24"/>
-        </w:rPr>
-        <w:t>царство,</w:t>
-      </w:r>
-      <w:r>
-        <w:rPr>
-          <w:rFonts w:ascii="Times New Roman" w:hAnsi="Times New Roman"/>
-          <w:color w:val="000000"/>
-          <w:sz w:val="24"/>
-        </w:rPr>
-        <w:t xml:space="preserve"> </w:t>
-      </w:r>
-      <w:r>
-        <w:rPr>
-          <w:rFonts w:ascii="Times New Roman" w:hAnsi="Times New Roman"/>
-          <w:color w:val="000000"/>
-          <w:sz w:val="24"/>
-        </w:rPr>
-        <w:t>і</w:t>
-      </w:r>
-      <w:r>
-        <w:rPr>
-          <w:rFonts w:ascii="Times New Roman" w:hAnsi="Times New Roman"/>
-          <w:color w:val="000000"/>
-          <w:sz w:val="24"/>
-        </w:rPr>
-        <w:t xml:space="preserve"> </w:t>
-      </w:r>
-      <w:r>
-        <w:rPr>
-          <w:rFonts w:ascii="Times New Roman" w:hAnsi="Times New Roman"/>
-          <w:color w:val="000000"/>
-          <w:sz w:val="24"/>
-        </w:rPr>
-        <w:t>сила,</w:t>
-      </w:r>
-      <w:r>
-        <w:rPr>
-          <w:rFonts w:ascii="Times New Roman" w:hAnsi="Times New Roman"/>
-          <w:color w:val="000000"/>
-          <w:sz w:val="24"/>
-        </w:rPr>
-        <w:t xml:space="preserve"> </w:t>
-      </w:r>
-      <w:r>
-        <w:rPr>
-          <w:rFonts w:ascii="Times New Roman" w:hAnsi="Times New Roman"/>
-          <w:color w:val="000000"/>
-          <w:sz w:val="24"/>
-        </w:rPr>
-        <w:t>і</w:t>
-      </w:r>
-      <w:r>
-        <w:rPr>
-          <w:rFonts w:ascii="Times New Roman" w:hAnsi="Times New Roman"/>
-          <w:color w:val="000000"/>
-          <w:sz w:val="24"/>
-        </w:rPr>
-        <w:t xml:space="preserve"> </w:t>
-      </w:r>
-      <w:r>
-        <w:rPr>
-          <w:rFonts w:ascii="Times New Roman" w:hAnsi="Times New Roman"/>
-          <w:color w:val="000000"/>
-          <w:sz w:val="24"/>
-        </w:rPr>
-        <w:t>слава,</w:t>
-      </w:r>
-      <w:r>
-        <w:rPr>
-          <w:rFonts w:ascii="Times New Roman" w:hAnsi="Times New Roman"/>
-          <w:color w:val="000000"/>
-          <w:sz w:val="24"/>
-        </w:rPr>
-        <w:t xml:space="preserve"> </w:t>
-      </w:r>
-      <w:r>
-        <w:rPr>
-          <w:rFonts w:ascii="Times New Roman" w:hAnsi="Times New Roman"/>
-          <w:color w:val="000000"/>
-          <w:sz w:val="24"/>
-        </w:rPr>
-        <w:t>Отця,</w:t>
-      </w:r>
-      <w:r>
-        <w:rPr>
-          <w:rFonts w:ascii="Times New Roman" w:hAnsi="Times New Roman"/>
-          <w:color w:val="000000"/>
-          <w:sz w:val="24"/>
-        </w:rPr>
-        <w:t xml:space="preserve"> </w:t>
-      </w:r>
-      <w:r>
-        <w:rPr>
-          <w:rFonts w:ascii="Times New Roman" w:hAnsi="Times New Roman"/>
-          <w:color w:val="000000"/>
-          <w:sz w:val="24"/>
-        </w:rPr>
-        <w:t>і</w:t>
-      </w:r>
-      <w:r>
-        <w:rPr>
-          <w:rFonts w:ascii="Times New Roman" w:hAnsi="Times New Roman"/>
-          <w:color w:val="000000"/>
-          <w:sz w:val="24"/>
-        </w:rPr>
-        <w:t xml:space="preserve"> </w:t>
-      </w:r>
-      <w:r>
-        <w:rPr>
-          <w:rFonts w:ascii="Times New Roman" w:hAnsi="Times New Roman"/>
-          <w:color w:val="000000"/>
-          <w:sz w:val="24"/>
-        </w:rPr>
-        <w:t>Сина,</w:t>
-      </w:r>
-      <w:r>
-        <w:rPr>
-          <w:rFonts w:ascii="Times New Roman" w:hAnsi="Times New Roman"/>
-          <w:color w:val="000000"/>
-          <w:sz w:val="24"/>
-        </w:rPr>
-        <w:t xml:space="preserve"> </w:t>
-      </w:r>
-      <w:r>
-        <w:rPr>
-          <w:rFonts w:ascii="Times New Roman" w:hAnsi="Times New Roman"/>
-          <w:color w:val="000000"/>
-          <w:sz w:val="24"/>
-        </w:rPr>
-        <w:t>і</w:t>
-      </w:r>
-      <w:r>
-        <w:rPr>
-          <w:rFonts w:ascii="Times New Roman" w:hAnsi="Times New Roman"/>
-          <w:color w:val="000000"/>
-          <w:sz w:val="24"/>
-        </w:rPr>
-        <w:t xml:space="preserve"> </w:t>
-      </w:r>
-      <w:r>
-        <w:rPr>
-          <w:rFonts w:ascii="Times New Roman" w:hAnsi="Times New Roman"/>
-          <w:color w:val="000000"/>
-          <w:sz w:val="24"/>
-        </w:rPr>
-        <w:t>Святого</w:t>
-      </w:r>
-      <w:r>
-        <w:rPr>
-          <w:rFonts w:ascii="Times New Roman" w:hAnsi="Times New Roman"/>
-          <w:color w:val="000000"/>
-          <w:sz w:val="24"/>
-        </w:rPr>
-        <w:t xml:space="preserve"> </w:t>
-      </w:r>
-      <w:r>
-        <w:rPr>
-          <w:rFonts w:ascii="Times New Roman" w:hAnsi="Times New Roman"/>
-          <w:color w:val="000000"/>
-          <w:sz w:val="24"/>
-        </w:rPr>
-        <w:t>Духа,</w:t>
-      </w:r>
-      <w:r>
-        <w:rPr>
-          <w:rFonts w:ascii="Times New Roman" w:hAnsi="Times New Roman"/>
-          <w:color w:val="000000"/>
-          <w:sz w:val="24"/>
-        </w:rPr>
-        <w:t xml:space="preserve"> </w:t>
-      </w:r>
-      <w:r>
-        <w:rPr>
-          <w:rFonts w:ascii="Times New Roman" w:hAnsi="Times New Roman"/>
-          <w:color w:val="000000"/>
-          <w:sz w:val="24"/>
-        </w:rPr>
-        <w:t>нині,</w:t>
-      </w:r>
-      <w:r>
-        <w:rPr>
-          <w:rFonts w:ascii="Times New Roman" w:hAnsi="Times New Roman"/>
-          <w:color w:val="000000"/>
-          <w:sz w:val="24"/>
-        </w:rPr>
-        <w:t xml:space="preserve"> </w:t>
-      </w:r>
-      <w:r>
-        <w:rPr>
-          <w:rFonts w:ascii="Times New Roman" w:hAnsi="Times New Roman"/>
-          <w:color w:val="000000"/>
-          <w:sz w:val="24"/>
-        </w:rPr>
-        <w:t>і</w:t>
-      </w:r>
-      <w:r>
-        <w:rPr>
-          <w:rFonts w:ascii="Times New Roman" w:hAnsi="Times New Roman"/>
-          <w:color w:val="000000"/>
-          <w:sz w:val="24"/>
-        </w:rPr>
-        <w:t xml:space="preserve"> </w:t>
-      </w:r>
-      <w:r>
-        <w:rPr>
-          <w:rFonts w:ascii="Times New Roman" w:hAnsi="Times New Roman"/>
-          <w:color w:val="000000"/>
-          <w:sz w:val="24"/>
-        </w:rPr>
-        <w:t>повсякчас,</w:t>
-      </w:r>
-      <w:r>
-        <w:rPr>
-          <w:rFonts w:ascii="Times New Roman" w:hAnsi="Times New Roman"/>
-          <w:color w:val="000000"/>
-          <w:sz w:val="24"/>
-        </w:rPr>
-        <w:t xml:space="preserve"> </w:t>
-      </w:r>
-      <w:r>
-        <w:rPr>
-          <w:rFonts w:ascii="Times New Roman" w:hAnsi="Times New Roman"/>
-          <w:color w:val="000000"/>
-          <w:sz w:val="24"/>
-        </w:rPr>
-        <w:t>і</w:t>
-      </w:r>
-      <w:r>
-        <w:rPr>
-          <w:rFonts w:ascii="Times New Roman" w:hAnsi="Times New Roman"/>
-          <w:color w:val="000000"/>
-          <w:sz w:val="24"/>
-        </w:rPr>
-        <w:t xml:space="preserve"> </w:t>
-      </w:r>
-      <w:r>
-        <w:rPr>
-          <w:rFonts w:ascii="Times New Roman" w:hAnsi="Times New Roman"/>
-          <w:color w:val="000000"/>
-          <w:sz w:val="24"/>
-        </w:rPr>
-        <w:t>на</w:t>
-      </w:r>
-      <w:r>
-        <w:rPr>
-          <w:rFonts w:ascii="Times New Roman" w:hAnsi="Times New Roman"/>
-          <w:color w:val="000000"/>
-          <w:sz w:val="24"/>
-        </w:rPr>
-        <w:t xml:space="preserve"> </w:t>
-      </w:r>
-      <w:r>
-        <w:rPr>
-          <w:rFonts w:ascii="Times New Roman" w:hAnsi="Times New Roman"/>
-          <w:color w:val="000000"/>
-          <w:sz w:val="24"/>
-        </w:rPr>
-        <w:t>віки</w:t>
-      </w:r>
-      <w:r>
-        <w:rPr>
-          <w:rFonts w:ascii="Times New Roman" w:hAnsi="Times New Roman"/>
-          <w:color w:val="000000"/>
-          <w:sz w:val="24"/>
-        </w:rPr>
-        <w:t xml:space="preserve"> </w:t>
-      </w:r>
-      <w:r>
-        <w:rPr>
-          <w:rFonts w:ascii="Times New Roman" w:hAnsi="Times New Roman"/>
-          <w:color w:val="000000"/>
-          <w:sz w:val="24"/>
-        </w:rPr>
-        <w:t>віків.</w:t>
+          <w:sz w:val="24"/>
+        </w:rPr>
+        <w:t xml:space="preserve"> Бо Твоя є влада і Твоє є царство, і сила, і слава, Отця, і Сина, і Святого Духа, нині, і повсякчас, і на віки віків.</w:t>
       </w:r>
     </w:p>
     <w:p>
@@ -22653,7 +21973,7 @@
         <w:rPr>
           <w:rFonts w:ascii="Times New Roman" w:hAnsi="Times New Roman"/>
           <w:i/>
-          <w:color w:val="FF4400"/>
+          <w:color w:val="FF0000"/>
           <w:sz w:val="24"/>
         </w:rPr>
         <w:t>Священник:</w:t>
@@ -22661,326 +21981,9 @@
       <w:r>
         <w:rPr>
           <w:rFonts w:ascii="Times New Roman" w:hAnsi="Times New Roman"/>
-          <w:i/>
-          <w:color w:val="FF4400"/>
-          <w:sz w:val="24"/>
-        </w:rPr>
-        <w:t xml:space="preserve"> </w:t>
-      </w:r>
-      <w:r>
-        <w:rPr>
-          <w:rFonts w:ascii="Times New Roman" w:hAnsi="Times New Roman"/>
-          <w:sz w:val="24"/>
-        </w:rPr>
-        <w:t>Бо</w:t>
-      </w:r>
-      <w:r>
-        <w:rPr>
-          <w:rFonts w:ascii="Times New Roman" w:hAnsi="Times New Roman"/>
-          <w:sz w:val="24"/>
-        </w:rPr>
-        <w:t xml:space="preserve"> </w:t>
-      </w:r>
-      <w:r>
-        <w:rPr>
-          <w:rFonts w:ascii="Times New Roman" w:hAnsi="Times New Roman"/>
-          <w:sz w:val="24"/>
-        </w:rPr>
-        <w:t>милостивий</w:t>
-      </w:r>
-      <w:r>
-        <w:rPr>
-          <w:rFonts w:ascii="Times New Roman" w:hAnsi="Times New Roman"/>
-          <w:sz w:val="24"/>
-        </w:rPr>
-        <w:t xml:space="preserve"> </w:t>
-      </w:r>
-      <w:r>
-        <w:rPr>
-          <w:rFonts w:ascii="Times New Roman" w:hAnsi="Times New Roman"/>
-          <w:sz w:val="24"/>
-        </w:rPr>
-        <w:t>і</w:t>
-      </w:r>
-      <w:r>
-        <w:rPr>
-          <w:rFonts w:ascii="Times New Roman" w:hAnsi="Times New Roman"/>
-          <w:sz w:val="24"/>
-        </w:rPr>
-        <w:t xml:space="preserve"> </w:t>
-      </w:r>
-      <w:r>
-        <w:rPr>
-          <w:rFonts w:ascii="Times New Roman" w:hAnsi="Times New Roman"/>
-          <w:sz w:val="24"/>
-        </w:rPr>
-        <w:t>людинолюбний</w:t>
-      </w:r>
-      <w:r>
-        <w:rPr>
-          <w:rFonts w:ascii="Times New Roman" w:hAnsi="Times New Roman"/>
-          <w:sz w:val="24"/>
-        </w:rPr>
-        <w:t xml:space="preserve"> </w:t>
-      </w:r>
-      <w:r>
-        <w:rPr>
-          <w:rFonts w:ascii="Times New Roman" w:hAnsi="Times New Roman"/>
-          <w:sz w:val="24"/>
-        </w:rPr>
-        <w:t>Бог</w:t>
-      </w:r>
-      <w:r>
-        <w:rPr>
-          <w:rFonts w:ascii="Times New Roman" w:hAnsi="Times New Roman"/>
-          <w:sz w:val="24"/>
-        </w:rPr>
-        <w:t xml:space="preserve"> </w:t>
-      </w:r>
-      <w:r>
-        <w:rPr>
-          <w:rFonts w:ascii="Times New Roman" w:hAnsi="Times New Roman"/>
-          <w:sz w:val="24"/>
-        </w:rPr>
-        <w:t>єси,</w:t>
-      </w:r>
-      <w:r>
-        <w:rPr>
-          <w:rFonts w:ascii="Times New Roman" w:hAnsi="Times New Roman"/>
-          <w:sz w:val="24"/>
-        </w:rPr>
-        <w:t xml:space="preserve"> </w:t>
-      </w:r>
-      <w:r>
-        <w:rPr>
-          <w:rFonts w:ascii="Times New Roman" w:hAnsi="Times New Roman"/>
-          <w:sz w:val="24"/>
-        </w:rPr>
-        <w:t>і</w:t>
-      </w:r>
-      <w:r>
-        <w:rPr>
-          <w:rFonts w:ascii="Times New Roman" w:hAnsi="Times New Roman"/>
-          <w:sz w:val="24"/>
-        </w:rPr>
-        <w:t xml:space="preserve"> </w:t>
-      </w:r>
-      <w:r>
-        <w:rPr>
-          <w:rFonts w:ascii="Times New Roman" w:hAnsi="Times New Roman"/>
-          <w:sz w:val="24"/>
-        </w:rPr>
-        <w:t>Тобі</w:t>
-      </w:r>
-      <w:r>
-        <w:rPr>
-          <w:rFonts w:ascii="Times New Roman" w:hAnsi="Times New Roman"/>
-          <w:sz w:val="24"/>
-        </w:rPr>
-        <w:t xml:space="preserve"> </w:t>
-      </w:r>
-      <w:r>
-        <w:rPr>
-          <w:rFonts w:ascii="Times New Roman" w:hAnsi="Times New Roman"/>
-          <w:sz w:val="24"/>
-        </w:rPr>
-        <w:t>славу</w:t>
-      </w:r>
-      <w:r>
-        <w:rPr>
-          <w:rFonts w:ascii="Times New Roman" w:hAnsi="Times New Roman"/>
-          <w:sz w:val="24"/>
-        </w:rPr>
-        <w:t xml:space="preserve"> </w:t>
-      </w:r>
-      <w:r>
-        <w:rPr>
-          <w:rFonts w:ascii="Times New Roman" w:hAnsi="Times New Roman"/>
-          <w:sz w:val="24"/>
-        </w:rPr>
-        <w:t>возсилаємо,</w:t>
-      </w:r>
-      <w:r>
-        <w:rPr>
-          <w:rFonts w:ascii="Times New Roman" w:hAnsi="Times New Roman"/>
-          <w:sz w:val="24"/>
-        </w:rPr>
-        <w:t xml:space="preserve"> </w:t>
-      </w:r>
-      <w:r>
-        <w:rPr>
-          <w:rFonts w:ascii="Times New Roman" w:hAnsi="Times New Roman"/>
-          <w:sz w:val="24"/>
-        </w:rPr>
-        <w:t>Отцю,</w:t>
-      </w:r>
-      <w:r>
-        <w:rPr>
-          <w:rFonts w:ascii="Times New Roman" w:hAnsi="Times New Roman"/>
-          <w:sz w:val="24"/>
-        </w:rPr>
-        <w:t xml:space="preserve"> </w:t>
-      </w:r>
-      <w:r>
-        <w:rPr>
-          <w:rFonts w:ascii="Times New Roman" w:hAnsi="Times New Roman"/>
-          <w:sz w:val="24"/>
-        </w:rPr>
-        <w:t>і</w:t>
-      </w:r>
-      <w:r>
-        <w:rPr>
-          <w:rFonts w:ascii="Times New Roman" w:hAnsi="Times New Roman"/>
-          <w:sz w:val="24"/>
-        </w:rPr>
-        <w:t xml:space="preserve"> </w:t>
-      </w:r>
-      <w:r>
-        <w:rPr>
-          <w:rFonts w:ascii="Times New Roman" w:hAnsi="Times New Roman"/>
-          <w:sz w:val="24"/>
-        </w:rPr>
-        <w:t>Сину,</w:t>
-      </w:r>
-      <w:r>
-        <w:rPr>
-          <w:rFonts w:ascii="Times New Roman" w:hAnsi="Times New Roman"/>
-          <w:sz w:val="24"/>
-        </w:rPr>
-        <w:t xml:space="preserve"> </w:t>
-      </w:r>
-      <w:r>
-        <w:rPr>
-          <w:rFonts w:ascii="Times New Roman" w:hAnsi="Times New Roman"/>
-          <w:sz w:val="24"/>
-        </w:rPr>
-        <w:t>і</w:t>
-      </w:r>
-      <w:r>
-        <w:rPr>
-          <w:rFonts w:ascii="Times New Roman" w:hAnsi="Times New Roman"/>
-          <w:sz w:val="24"/>
-        </w:rPr>
-        <w:t xml:space="preserve"> </w:t>
-      </w:r>
-      <w:r>
-        <w:rPr>
-          <w:rFonts w:ascii="Times New Roman" w:hAnsi="Times New Roman"/>
-          <w:sz w:val="24"/>
-        </w:rPr>
-        <w:t>Святому</w:t>
-      </w:r>
-      <w:r>
-        <w:rPr>
-          <w:rFonts w:ascii="Times New Roman" w:hAnsi="Times New Roman"/>
-          <w:sz w:val="24"/>
-        </w:rPr>
-        <w:t xml:space="preserve"> </w:t>
-      </w:r>
-      <w:r>
-        <w:rPr>
-          <w:rFonts w:ascii="Times New Roman" w:hAnsi="Times New Roman"/>
-          <w:sz w:val="24"/>
-        </w:rPr>
-        <w:t>Духові,</w:t>
-      </w:r>
-      <w:r>
-        <w:rPr>
-          <w:rFonts w:ascii="Times New Roman" w:hAnsi="Times New Roman"/>
-          <w:sz w:val="24"/>
-        </w:rPr>
-        <w:t xml:space="preserve"> </w:t>
-      </w:r>
-      <w:r>
-        <w:rPr>
-          <w:rFonts w:ascii="Times New Roman" w:hAnsi="Times New Roman"/>
-          <w:sz w:val="24"/>
-        </w:rPr>
-        <w:t>нині,</w:t>
-      </w:r>
-      <w:r>
-        <w:rPr>
-          <w:rFonts w:ascii="Times New Roman" w:hAnsi="Times New Roman"/>
-          <w:sz w:val="24"/>
-        </w:rPr>
-        <w:t xml:space="preserve"> </w:t>
-      </w:r>
-      <w:r>
-        <w:rPr>
-          <w:rFonts w:ascii="Times New Roman" w:hAnsi="Times New Roman"/>
-          <w:sz w:val="24"/>
-        </w:rPr>
-        <w:t>і</w:t>
-      </w:r>
-      <w:r>
-        <w:rPr>
-          <w:rFonts w:ascii="Times New Roman" w:hAnsi="Times New Roman"/>
-          <w:sz w:val="24"/>
-        </w:rPr>
-        <w:t xml:space="preserve"> </w:t>
-      </w:r>
-      <w:r>
-        <w:rPr>
-          <w:rFonts w:ascii="Times New Roman" w:hAnsi="Times New Roman"/>
-          <w:sz w:val="24"/>
-        </w:rPr>
-        <w:t>повсякчас,</w:t>
-      </w:r>
-      <w:r>
-        <w:rPr>
-          <w:rFonts w:ascii="Times New Roman" w:hAnsi="Times New Roman"/>
-          <w:sz w:val="24"/>
-        </w:rPr>
-        <w:t xml:space="preserve"> </w:t>
-      </w:r>
-      <w:r>
-        <w:rPr>
-          <w:rFonts w:ascii="Times New Roman" w:hAnsi="Times New Roman"/>
-          <w:sz w:val="24"/>
-        </w:rPr>
-        <w:t>і</w:t>
-      </w:r>
-      <w:r>
-        <w:rPr>
-          <w:rFonts w:ascii="Times New Roman" w:hAnsi="Times New Roman"/>
-          <w:sz w:val="24"/>
-        </w:rPr>
-        <w:t xml:space="preserve"> </w:t>
-      </w:r>
-      <w:r>
-        <w:rPr>
-          <w:rFonts w:ascii="Times New Roman" w:hAnsi="Times New Roman"/>
-          <w:sz w:val="24"/>
-        </w:rPr>
-        <w:t>на</w:t>
-      </w:r>
-      <w:r>
-        <w:rPr>
-          <w:rFonts w:ascii="Times New Roman" w:hAnsi="Times New Roman"/>
-          <w:sz w:val="24"/>
-        </w:rPr>
-        <w:t xml:space="preserve"> </w:t>
-      </w:r>
-      <w:r>
-        <w:rPr>
-          <w:rFonts w:ascii="Times New Roman" w:hAnsi="Times New Roman"/>
-          <w:sz w:val="24"/>
-        </w:rPr>
-        <w:t>віки</w:t>
-      </w:r>
-      <w:r>
-        <w:rPr>
-          <w:rFonts w:ascii="Times New Roman" w:hAnsi="Times New Roman"/>
-          <w:sz w:val="24"/>
-        </w:rPr>
-        <w:t xml:space="preserve"> </w:t>
-      </w:r>
-      <w:r>
-        <w:rPr>
-          <w:rFonts w:ascii="Times New Roman" w:hAnsi="Times New Roman"/>
-          <w:sz w:val="24"/>
-        </w:rPr>
-        <w:t>віків.</w:t>
+          <w:sz w:val="24"/>
+        </w:rPr>
+        <w:t xml:space="preserve"> Бо милостивий і людинолюбний Бог єси, і Тобі славу возсилаємо, Отцю, і Сину, і Святому Духові, нині, і повсякчас, і на віки віків.</w:t>
       </w:r>
     </w:p>
     <w:p>
@@ -29368,294 +28371,7 @@
           <w:rFonts w:ascii="Times New Roman" w:hAnsi="Times New Roman"/>
           <w:sz w:val="24"/>
         </w:rPr>
-        <w:t xml:space="preserve"> </w:t>
-      </w:r>
-      <w:r>
-        <w:rPr>
-          <w:rFonts w:ascii="Times New Roman" w:hAnsi="Times New Roman"/>
-          <w:sz w:val="24"/>
-        </w:rPr>
-        <w:t>Бо</w:t>
-      </w:r>
-      <w:r>
-        <w:rPr>
-          <w:rFonts w:ascii="Times New Roman" w:hAnsi="Times New Roman"/>
-          <w:sz w:val="24"/>
-        </w:rPr>
-        <w:t xml:space="preserve"> </w:t>
-      </w:r>
-      <w:r>
-        <w:rPr>
-          <w:rFonts w:ascii="Times New Roman" w:hAnsi="Times New Roman"/>
-          <w:sz w:val="24"/>
-        </w:rPr>
-        <w:t>Твоє</w:t>
-      </w:r>
-      <w:r>
-        <w:rPr>
-          <w:rFonts w:ascii="Times New Roman" w:hAnsi="Times New Roman"/>
-          <w:sz w:val="24"/>
-        </w:rPr>
-        <w:t xml:space="preserve"> </w:t>
-      </w:r>
-      <w:r>
-        <w:rPr>
-          <w:rFonts w:ascii="Times New Roman" w:hAnsi="Times New Roman"/>
-          <w:sz w:val="24"/>
-        </w:rPr>
-        <w:t>є</w:t>
-      </w:r>
-      <w:r>
-        <w:rPr>
-          <w:rFonts w:ascii="Times New Roman" w:hAnsi="Times New Roman"/>
-          <w:sz w:val="24"/>
-        </w:rPr>
-        <w:t xml:space="preserve"> </w:t>
-      </w:r>
-      <w:r>
-        <w:rPr>
-          <w:rFonts w:ascii="Times New Roman" w:hAnsi="Times New Roman"/>
-          <w:sz w:val="24"/>
-        </w:rPr>
-        <w:t>царство,</w:t>
-      </w:r>
-      <w:r>
-        <w:rPr>
-          <w:rFonts w:ascii="Times New Roman" w:hAnsi="Times New Roman"/>
-          <w:sz w:val="24"/>
-        </w:rPr>
-        <w:t xml:space="preserve"> </w:t>
-      </w:r>
-      <w:r>
-        <w:rPr>
-          <w:rFonts w:ascii="Times New Roman" w:hAnsi="Times New Roman"/>
-          <w:sz w:val="24"/>
-        </w:rPr>
-        <w:t>і</w:t>
-      </w:r>
-      <w:r>
-        <w:rPr>
-          <w:rFonts w:ascii="Times New Roman" w:hAnsi="Times New Roman"/>
-          <w:sz w:val="24"/>
-        </w:rPr>
-        <w:t xml:space="preserve"> </w:t>
-      </w:r>
-      <w:r>
-        <w:rPr>
-          <w:rFonts w:ascii="Times New Roman" w:hAnsi="Times New Roman"/>
-          <w:sz w:val="24"/>
-        </w:rPr>
-        <w:t>сила,</w:t>
-      </w:r>
-      <w:r>
-        <w:rPr>
-          <w:rFonts w:ascii="Times New Roman" w:hAnsi="Times New Roman"/>
-          <w:sz w:val="24"/>
-        </w:rPr>
-        <w:t xml:space="preserve"> </w:t>
-      </w:r>
-      <w:r>
-        <w:rPr>
-          <w:rFonts w:ascii="Times New Roman" w:hAnsi="Times New Roman"/>
-          <w:sz w:val="24"/>
-        </w:rPr>
-        <w:t>і</w:t>
-      </w:r>
-      <w:r>
-        <w:rPr>
-          <w:rFonts w:ascii="Times New Roman" w:hAnsi="Times New Roman"/>
-          <w:sz w:val="24"/>
-        </w:rPr>
-        <w:t xml:space="preserve"> </w:t>
-      </w:r>
-      <w:r>
-        <w:rPr>
-          <w:rFonts w:ascii="Times New Roman" w:hAnsi="Times New Roman"/>
-          <w:sz w:val="24"/>
-        </w:rPr>
-        <w:t>слава,</w:t>
-      </w:r>
-      <w:r>
-        <w:rPr>
-          <w:rFonts w:ascii="Times New Roman" w:hAnsi="Times New Roman"/>
-          <w:sz w:val="24"/>
-        </w:rPr>
-        <w:t xml:space="preserve"> </w:t>
-      </w:r>
-      <w:r>
-        <w:rPr>
-          <w:rFonts w:ascii="Times New Roman" w:hAnsi="Times New Roman"/>
-          <w:sz w:val="24"/>
-        </w:rPr>
-        <w:t>Отця,</w:t>
-      </w:r>
-      <w:r>
-        <w:rPr>
-          <w:rFonts w:ascii="Times New Roman" w:hAnsi="Times New Roman"/>
-          <w:sz w:val="24"/>
-        </w:rPr>
-        <w:t xml:space="preserve"> </w:t>
-      </w:r>
-      <w:r>
-        <w:rPr>
-          <w:rFonts w:ascii="Times New Roman" w:hAnsi="Times New Roman"/>
-          <w:sz w:val="24"/>
-        </w:rPr>
-        <w:t>і</w:t>
-      </w:r>
-      <w:r>
-        <w:rPr>
-          <w:rFonts w:ascii="Times New Roman" w:hAnsi="Times New Roman"/>
-          <w:sz w:val="24"/>
-        </w:rPr>
-        <w:t xml:space="preserve"> </w:t>
-      </w:r>
-      <w:r>
-        <w:rPr>
-          <w:rFonts w:ascii="Times New Roman" w:hAnsi="Times New Roman"/>
-          <w:sz w:val="24"/>
-        </w:rPr>
-        <w:t>Сина,</w:t>
-      </w:r>
-      <w:r>
-        <w:rPr>
-          <w:rFonts w:ascii="Times New Roman" w:hAnsi="Times New Roman"/>
-          <w:sz w:val="24"/>
-        </w:rPr>
-        <w:t xml:space="preserve"> </w:t>
-      </w:r>
-      <w:r>
-        <w:rPr>
-          <w:rFonts w:ascii="Times New Roman" w:hAnsi="Times New Roman"/>
-          <w:sz w:val="24"/>
-        </w:rPr>
-        <w:t>і</w:t>
-      </w:r>
-      <w:r>
-        <w:rPr>
-          <w:rFonts w:ascii="Times New Roman" w:hAnsi="Times New Roman"/>
-          <w:sz w:val="24"/>
-        </w:rPr>
-        <w:t xml:space="preserve"> </w:t>
-      </w:r>
-      <w:r>
-        <w:rPr>
-          <w:rFonts w:ascii="Times New Roman" w:hAnsi="Times New Roman"/>
-          <w:sz w:val="24"/>
-        </w:rPr>
-        <w:t>Святого</w:t>
-      </w:r>
-      <w:r>
-        <w:rPr>
-          <w:rFonts w:ascii="Times New Roman" w:hAnsi="Times New Roman"/>
-          <w:sz w:val="24"/>
-        </w:rPr>
-        <w:t xml:space="preserve"> </w:t>
-      </w:r>
-      <w:r>
-        <w:rPr>
-          <w:rFonts w:ascii="Times New Roman" w:hAnsi="Times New Roman"/>
-          <w:sz w:val="24"/>
-        </w:rPr>
-        <w:t>Духа,</w:t>
-      </w:r>
-      <w:r>
-        <w:rPr>
-          <w:rFonts w:ascii="Times New Roman" w:hAnsi="Times New Roman"/>
-          <w:sz w:val="24"/>
-        </w:rPr>
-        <w:t xml:space="preserve"> </w:t>
-      </w:r>
-      <w:r>
-        <w:rPr>
-          <w:rFonts w:ascii="Times New Roman" w:hAnsi="Times New Roman"/>
-          <w:sz w:val="24"/>
-        </w:rPr>
-        <w:t>нині,</w:t>
-      </w:r>
-      <w:r>
-        <w:rPr>
-          <w:rFonts w:ascii="Times New Roman" w:hAnsi="Times New Roman"/>
-          <w:sz w:val="24"/>
-        </w:rPr>
-        <w:t xml:space="preserve"> </w:t>
-      </w:r>
-      <w:r>
-        <w:rPr>
-          <w:rFonts w:ascii="Times New Roman" w:hAnsi="Times New Roman"/>
-          <w:sz w:val="24"/>
-        </w:rPr>
-        <w:t>і</w:t>
-      </w:r>
-      <w:r>
-        <w:rPr>
-          <w:rFonts w:ascii="Times New Roman" w:hAnsi="Times New Roman"/>
-          <w:sz w:val="24"/>
-        </w:rPr>
-        <w:t xml:space="preserve"> </w:t>
-      </w:r>
-      <w:r>
-        <w:rPr>
-          <w:rFonts w:ascii="Times New Roman" w:hAnsi="Times New Roman"/>
-          <w:sz w:val="24"/>
-        </w:rPr>
-        <w:t>повсякчас,</w:t>
-      </w:r>
-      <w:r>
-        <w:rPr>
-          <w:rFonts w:ascii="Times New Roman" w:hAnsi="Times New Roman"/>
-          <w:sz w:val="24"/>
-        </w:rPr>
-        <w:t xml:space="preserve"> </w:t>
-      </w:r>
-      <w:r>
-        <w:rPr>
-          <w:rFonts w:ascii="Times New Roman" w:hAnsi="Times New Roman"/>
-          <w:sz w:val="24"/>
-        </w:rPr>
-        <w:t>і</w:t>
-      </w:r>
-      <w:r>
-        <w:rPr>
-          <w:rFonts w:ascii="Times New Roman" w:hAnsi="Times New Roman"/>
-          <w:sz w:val="24"/>
-        </w:rPr>
-        <w:t xml:space="preserve"> </w:t>
-      </w:r>
-      <w:r>
-        <w:rPr>
-          <w:rFonts w:ascii="Times New Roman" w:hAnsi="Times New Roman"/>
-          <w:sz w:val="24"/>
-        </w:rPr>
-        <w:t>на</w:t>
-      </w:r>
-      <w:r>
-        <w:rPr>
-          <w:rFonts w:ascii="Times New Roman" w:hAnsi="Times New Roman"/>
-          <w:sz w:val="24"/>
-        </w:rPr>
-        <w:t xml:space="preserve"> </w:t>
-      </w:r>
-      <w:r>
-        <w:rPr>
-          <w:rFonts w:ascii="Times New Roman" w:hAnsi="Times New Roman"/>
-          <w:sz w:val="24"/>
-        </w:rPr>
-        <w:t>віки</w:t>
-      </w:r>
-      <w:r>
-        <w:rPr>
-          <w:rFonts w:ascii="Times New Roman" w:hAnsi="Times New Roman"/>
-          <w:sz w:val="24"/>
-        </w:rPr>
-        <w:t xml:space="preserve"> </w:t>
-      </w:r>
-      <w:r>
-        <w:rPr>
-          <w:rFonts w:ascii="Times New Roman" w:hAnsi="Times New Roman"/>
-          <w:sz w:val="24"/>
-        </w:rPr>
-        <w:t>віків.</w:t>
+        <w:t xml:space="preserve"> Бо Твоє є царство, і сила, і слава, Отця, і Сина, і Святого Духа, нині, і повсякчас, і на віки віків.</w:t>
       </w:r>
     </w:p>
     <w:p>
@@ -31873,40 +30589,14 @@
           <w:color w:val="FF0000"/>
           <w:sz w:val="24"/>
         </w:rPr>
-        <w:t>Священ</w:t>
-      </w:r>
-      <w:r>
-        <w:rPr>
-          <w:rFonts w:ascii="Times New Roman" w:hAnsi="Times New Roman"/>
-          <w:i/>
-          <w:color w:val="FF0000"/>
-          <w:sz w:val="24"/>
-        </w:rPr>
-        <w:t>н</w:t>
-      </w:r>
-      <w:r>
-        <w:rPr>
-          <w:rFonts w:ascii="Times New Roman" w:hAnsi="Times New Roman"/>
-          <w:i/>
-          <w:color w:val="FF0000"/>
-          <w:sz w:val="24"/>
-        </w:rPr>
-        <w:t>ик:</w:t>
-      </w:r>
-      <w:r>
-        <w:rPr>
-          <w:rFonts w:ascii="Times New Roman" w:hAnsi="Times New Roman"/>
-          <w:color w:val="FF0000"/>
-          <w:sz w:val="24"/>
-        </w:rPr>
-        <w:t xml:space="preserve"> </w:t>
-      </w:r>
-      <w:r>
-        <w:rPr>
-          <w:rFonts w:ascii="Times New Roman" w:hAnsi="Times New Roman"/>
-          <w:sz w:val="24"/>
-        </w:rPr>
-        <w:t>Благослове́нний Христо́с Бог наш, за́вжди, ни́ні, і повсякча́с, і на ві́ки вікі́в.</w:t>
+        <w:t>Священник:</w:t>
+      </w:r>
+      <w:r>
+        <w:rPr>
+          <w:rFonts w:ascii="Times New Roman" w:hAnsi="Times New Roman"/>
+          <w:sz w:val="24"/>
+        </w:rPr>
+        <w:t xml:space="preserve"> Благослове́нний Христо́с Бог наш, за́вжди, ни́ні, і повсякча́с, і на ві́ки вікі́в.</w:t>
       </w:r>
     </w:p>
     <w:p>
@@ -31949,40 +30639,14 @@
           <w:color w:val="FF0000"/>
           <w:sz w:val="24"/>
         </w:rPr>
-        <w:t>Священ</w:t>
-      </w:r>
-      <w:r>
-        <w:rPr>
-          <w:rFonts w:ascii="Times New Roman" w:hAnsi="Times New Roman"/>
-          <w:i/>
-          <w:color w:val="FF0000"/>
-          <w:sz w:val="24"/>
-        </w:rPr>
-        <w:t>н</w:t>
-      </w:r>
-      <w:r>
-        <w:rPr>
-          <w:rFonts w:ascii="Times New Roman" w:hAnsi="Times New Roman"/>
-          <w:i/>
-          <w:color w:val="FF0000"/>
-          <w:sz w:val="24"/>
-        </w:rPr>
-        <w:t>ик:</w:t>
-      </w:r>
-      <w:r>
-        <w:rPr>
-          <w:rFonts w:ascii="Times New Roman" w:hAnsi="Times New Roman"/>
-          <w:color w:val="FF0000"/>
-          <w:sz w:val="24"/>
-        </w:rPr>
-        <w:t xml:space="preserve"> </w:t>
-      </w:r>
-      <w:r>
-        <w:rPr>
-          <w:rFonts w:ascii="Times New Roman" w:hAnsi="Times New Roman"/>
-          <w:sz w:val="24"/>
-        </w:rPr>
-        <w:t>Пресвята́ Богоро́дице, спаси́ нас.</w:t>
+        <w:t>Священник:</w:t>
+      </w:r>
+      <w:r>
+        <w:rPr>
+          <w:rFonts w:ascii="Times New Roman" w:hAnsi="Times New Roman"/>
+          <w:sz w:val="24"/>
+        </w:rPr>
+        <w:t xml:space="preserve"> Пресвята́ Богоро́дице, спаси́ нас.</w:t>
       </w:r>
     </w:p>
     <w:p>
@@ -32025,40 +30689,14 @@
           <w:color w:val="FF0000"/>
           <w:sz w:val="24"/>
         </w:rPr>
-        <w:t>Священ</w:t>
-      </w:r>
-      <w:r>
-        <w:rPr>
-          <w:rFonts w:ascii="Times New Roman" w:hAnsi="Times New Roman"/>
-          <w:i/>
-          <w:color w:val="FF0000"/>
-          <w:sz w:val="24"/>
-        </w:rPr>
-        <w:t>н</w:t>
-      </w:r>
-      <w:r>
-        <w:rPr>
-          <w:rFonts w:ascii="Times New Roman" w:hAnsi="Times New Roman"/>
-          <w:i/>
-          <w:color w:val="FF0000"/>
-          <w:sz w:val="24"/>
-        </w:rPr>
-        <w:t>ик:</w:t>
-      </w:r>
-      <w:r>
-        <w:rPr>
-          <w:rFonts w:ascii="Times New Roman" w:hAnsi="Times New Roman"/>
-          <w:color w:val="FF0000"/>
-          <w:sz w:val="24"/>
-        </w:rPr>
-        <w:t xml:space="preserve"> </w:t>
-      </w:r>
-      <w:r>
-        <w:rPr>
-          <w:rFonts w:ascii="Times New Roman" w:hAnsi="Times New Roman"/>
-          <w:sz w:val="24"/>
-        </w:rPr>
-        <w:t>Сла́ва Тобі́, Хри́сте Бо́же, упова́ння на́ше, сла́ва Тобі́!</w:t>
+        <w:t>Священник:</w:t>
+      </w:r>
+      <w:r>
+        <w:rPr>
+          <w:rFonts w:ascii="Times New Roman" w:hAnsi="Times New Roman"/>
+          <w:sz w:val="24"/>
+        </w:rPr>
+        <w:t xml:space="preserve"> Сла́ва Тобі́, Хри́сте Бо́же, упова́ння на́ше, сла́ва Тобі́!</w:t>
       </w:r>
     </w:p>
     <w:p>
@@ -32109,38 +30747,38 @@
     <w:p>
       <w:pPr>
         <w:spacing w:after="120"/>
-        <w:jc w:val="both"/>
-        <w:rPr>
-          <w:rFonts w:ascii="Times New Roman" w:eastAsia="Times New Roman" w:hAnsi="Times New Roman" w:cs="Times New Roman"/>
-          <w:sz w:val="24"/>
-          <w:szCs w:val="24"/>
-        </w:rPr>
-      </w:pPr>
-      <w:r>
-        <w:rPr>
-          <w:rFonts w:ascii="Times New Roman" w:eastAsia="Times New Roman" w:hAnsi="Times New Roman" w:cs="Times New Roman"/>
-          <w:i/>
-          <w:color w:val="FF0000"/>
-          <w:sz w:val="24"/>
-          <w:szCs w:val="24"/>
-        </w:rPr>
-        <w:t>Священик:</w:t>
-      </w:r>
-      <w:r>
-        <w:rPr>
-          <w:rFonts w:ascii="Times New Roman" w:eastAsia="Times New Roman" w:hAnsi="Times New Roman" w:cs="Times New Roman"/>
-          <w:sz w:val="24"/>
-          <w:szCs w:val="24"/>
-        </w:rPr>
-        <w:t xml:space="preserve"> Христос, істинний Бог наш, що прийняв по вісьмох днях законне обрізання спасіння нашого ради, молитвами пречистої своєї Матері і святого отця нашого Василія Великого, архиєпископа Кесарії</w:t>
-      </w:r>
-      <w:r>
-        <w:rPr>
-          <w:rFonts w:ascii="Times New Roman" w:eastAsia="Times New Roman" w:hAnsi="Times New Roman" w:cs="Times New Roman"/>
-          <w:sz w:val="24"/>
-          <w:szCs w:val="24"/>
-        </w:rPr>
-        <w:t xml:space="preserve"> Кападокійської, якого світлу пам'ять днесь урочисто святкуємо, і всіх святих, помилує і спасе нас, як благий і людинолюбний.</w:t>
+      </w:pPr>
+      <w:r>
+        <w:rPr>
+          <w:rFonts w:ascii="Times New Roman" w:hAnsi="Times New Roman"/>
+          <w:i/>
+          <w:color w:val="FF0000"/>
+          <w:sz w:val="24"/>
+        </w:rPr>
+        <w:t>Священник:</w:t>
+      </w:r>
+      <w:r>
+        <w:rPr>
+          <w:rFonts w:ascii="Times New Roman" w:hAnsi="Times New Roman"/>
+          <w:sz w:val="24"/>
+        </w:rPr>
+        <w:t xml:space="preserve"> Христос, істинний Бог наш, що по вісьмох днях прийняв законне обрізання спасіння нашого ради - молитвами пречистої Cвоєї Матері, святих славних і всехвальних апостолів, святого отця нашого Василія Великого, архиєпископа Кесарії Кападокійської, якого сьогодні пам'ять світло звершуємо, і святого, </w:t>
+      </w:r>
+      <w:r>
+        <w:rPr>
+          <w:rFonts w:ascii="Times New Roman" w:hAnsi="Times New Roman"/>
+          <w:i/>
+          <w:color w:val="FF0000"/>
+          <w:sz w:val="24"/>
+        </w:rPr>
+        <w:t>якого є храм</w:t>
+      </w:r>
+      <w:r>
+        <w:rPr>
+          <w:rFonts w:ascii="Times New Roman" w:hAnsi="Times New Roman"/>
+          <w:sz w:val="24"/>
+        </w:rPr>
+        <w:t>, і всіх святих - помилує і спасе нас як благий і людинолюбний.</w:t>
       </w:r>
     </w:p>
     <w:p>
@@ -39167,7 +37805,7 @@
         <w:rPr>
           <w:rFonts w:ascii="Times New Roman" w:hAnsi="Times New Roman"/>
           <w:i/>
-          <w:color w:val="FF4400"/>
+          <w:color w:val="FF0000"/>
           <w:sz w:val="24"/>
         </w:rPr>
         <w:t>Священник:</w:t>
@@ -39177,294 +37815,7 @@
           <w:rFonts w:ascii="Times New Roman" w:hAnsi="Times New Roman"/>
           <w:sz w:val="24"/>
         </w:rPr>
-        <w:t xml:space="preserve"> </w:t>
-      </w:r>
-      <w:r>
-        <w:rPr>
-          <w:rFonts w:ascii="Times New Roman" w:hAnsi="Times New Roman"/>
-          <w:sz w:val="24"/>
-        </w:rPr>
-        <w:t>Бо</w:t>
-      </w:r>
-      <w:r>
-        <w:rPr>
-          <w:rFonts w:ascii="Times New Roman" w:hAnsi="Times New Roman"/>
-          <w:sz w:val="24"/>
-        </w:rPr>
-        <w:t xml:space="preserve"> </w:t>
-      </w:r>
-      <w:r>
-        <w:rPr>
-          <w:rFonts w:ascii="Times New Roman" w:hAnsi="Times New Roman"/>
-          <w:sz w:val="24"/>
-        </w:rPr>
-        <w:t>Тобі</w:t>
-      </w:r>
-      <w:r>
-        <w:rPr>
-          <w:rFonts w:ascii="Times New Roman" w:hAnsi="Times New Roman"/>
-          <w:sz w:val="24"/>
-        </w:rPr>
-        <w:t xml:space="preserve"> </w:t>
-      </w:r>
-      <w:r>
-        <w:rPr>
-          <w:rFonts w:ascii="Times New Roman" w:hAnsi="Times New Roman"/>
-          <w:sz w:val="24"/>
-        </w:rPr>
-        <w:t>належить</w:t>
-      </w:r>
-      <w:r>
-        <w:rPr>
-          <w:rFonts w:ascii="Times New Roman" w:hAnsi="Times New Roman"/>
-          <w:sz w:val="24"/>
-        </w:rPr>
-        <w:t xml:space="preserve"> </w:t>
-      </w:r>
-      <w:r>
-        <w:rPr>
-          <w:rFonts w:ascii="Times New Roman" w:hAnsi="Times New Roman"/>
-          <w:sz w:val="24"/>
-        </w:rPr>
-        <w:t>усяка</w:t>
-      </w:r>
-      <w:r>
-        <w:rPr>
-          <w:rFonts w:ascii="Times New Roman" w:hAnsi="Times New Roman"/>
-          <w:sz w:val="24"/>
-        </w:rPr>
-        <w:t xml:space="preserve"> </w:t>
-      </w:r>
-      <w:r>
-        <w:rPr>
-          <w:rFonts w:ascii="Times New Roman" w:hAnsi="Times New Roman"/>
-          <w:sz w:val="24"/>
-        </w:rPr>
-        <w:t>слава,</w:t>
-      </w:r>
-      <w:r>
-        <w:rPr>
-          <w:rFonts w:ascii="Times New Roman" w:hAnsi="Times New Roman"/>
-          <w:sz w:val="24"/>
-        </w:rPr>
-        <w:t xml:space="preserve"> </w:t>
-      </w:r>
-      <w:r>
-        <w:rPr>
-          <w:rFonts w:ascii="Times New Roman" w:hAnsi="Times New Roman"/>
-          <w:sz w:val="24"/>
-        </w:rPr>
-        <w:t>честь</w:t>
-      </w:r>
-      <w:r>
-        <w:rPr>
-          <w:rFonts w:ascii="Times New Roman" w:hAnsi="Times New Roman"/>
-          <w:sz w:val="24"/>
-        </w:rPr>
-        <w:t xml:space="preserve"> </w:t>
-      </w:r>
-      <w:r>
-        <w:rPr>
-          <w:rFonts w:ascii="Times New Roman" w:hAnsi="Times New Roman"/>
-          <w:sz w:val="24"/>
-        </w:rPr>
-        <w:t>і</w:t>
-      </w:r>
-      <w:r>
-        <w:rPr>
-          <w:rFonts w:ascii="Times New Roman" w:hAnsi="Times New Roman"/>
-          <w:sz w:val="24"/>
-        </w:rPr>
-        <w:t xml:space="preserve"> </w:t>
-      </w:r>
-      <w:r>
-        <w:rPr>
-          <w:rFonts w:ascii="Times New Roman" w:hAnsi="Times New Roman"/>
-          <w:sz w:val="24"/>
-        </w:rPr>
-        <w:t>поклоніння,</w:t>
-      </w:r>
-      <w:r>
-        <w:rPr>
-          <w:rFonts w:ascii="Times New Roman" w:hAnsi="Times New Roman"/>
-          <w:sz w:val="24"/>
-        </w:rPr>
-        <w:t xml:space="preserve"> </w:t>
-      </w:r>
-      <w:r>
-        <w:rPr>
-          <w:rFonts w:ascii="Times New Roman" w:hAnsi="Times New Roman"/>
-          <w:sz w:val="24"/>
-        </w:rPr>
-        <w:t>Отцю,</w:t>
-      </w:r>
-      <w:r>
-        <w:rPr>
-          <w:rFonts w:ascii="Times New Roman" w:hAnsi="Times New Roman"/>
-          <w:sz w:val="24"/>
-        </w:rPr>
-        <w:t xml:space="preserve"> </w:t>
-      </w:r>
-      <w:r>
-        <w:rPr>
-          <w:rFonts w:ascii="Times New Roman" w:hAnsi="Times New Roman"/>
-          <w:sz w:val="24"/>
-        </w:rPr>
-        <w:t>і</w:t>
-      </w:r>
-      <w:r>
-        <w:rPr>
-          <w:rFonts w:ascii="Times New Roman" w:hAnsi="Times New Roman"/>
-          <w:sz w:val="24"/>
-        </w:rPr>
-        <w:t xml:space="preserve"> </w:t>
-      </w:r>
-      <w:r>
-        <w:rPr>
-          <w:rFonts w:ascii="Times New Roman" w:hAnsi="Times New Roman"/>
-          <w:sz w:val="24"/>
-        </w:rPr>
-        <w:t>Сину,</w:t>
-      </w:r>
-      <w:r>
-        <w:rPr>
-          <w:rFonts w:ascii="Times New Roman" w:hAnsi="Times New Roman"/>
-          <w:sz w:val="24"/>
-        </w:rPr>
-        <w:t xml:space="preserve"> </w:t>
-      </w:r>
-      <w:r>
-        <w:rPr>
-          <w:rFonts w:ascii="Times New Roman" w:hAnsi="Times New Roman"/>
-          <w:sz w:val="24"/>
-        </w:rPr>
-        <w:t>і</w:t>
-      </w:r>
-      <w:r>
-        <w:rPr>
-          <w:rFonts w:ascii="Times New Roman" w:hAnsi="Times New Roman"/>
-          <w:sz w:val="24"/>
-        </w:rPr>
-        <w:t xml:space="preserve"> </w:t>
-      </w:r>
-      <w:r>
-        <w:rPr>
-          <w:rFonts w:ascii="Times New Roman" w:hAnsi="Times New Roman"/>
-          <w:sz w:val="24"/>
-        </w:rPr>
-        <w:t>Святому</w:t>
-      </w:r>
-      <w:r>
-        <w:rPr>
-          <w:rFonts w:ascii="Times New Roman" w:hAnsi="Times New Roman"/>
-          <w:sz w:val="24"/>
-        </w:rPr>
-        <w:t xml:space="preserve"> </w:t>
-      </w:r>
-      <w:r>
-        <w:rPr>
-          <w:rFonts w:ascii="Times New Roman" w:hAnsi="Times New Roman"/>
-          <w:sz w:val="24"/>
-        </w:rPr>
-        <w:t>Духові,</w:t>
-      </w:r>
-      <w:r>
-        <w:rPr>
-          <w:rFonts w:ascii="Times New Roman" w:hAnsi="Times New Roman"/>
-          <w:sz w:val="24"/>
-        </w:rPr>
-        <w:t xml:space="preserve"> </w:t>
-      </w:r>
-      <w:r>
-        <w:rPr>
-          <w:rFonts w:ascii="Times New Roman" w:hAnsi="Times New Roman"/>
-          <w:sz w:val="24"/>
-        </w:rPr>
-        <w:t>нині,</w:t>
-      </w:r>
-      <w:r>
-        <w:rPr>
-          <w:rFonts w:ascii="Times New Roman" w:hAnsi="Times New Roman"/>
-          <w:sz w:val="24"/>
-        </w:rPr>
-        <w:t xml:space="preserve"> </w:t>
-      </w:r>
-      <w:r>
-        <w:rPr>
-          <w:rFonts w:ascii="Times New Roman" w:hAnsi="Times New Roman"/>
-          <w:sz w:val="24"/>
-        </w:rPr>
-        <w:t>і</w:t>
-      </w:r>
-      <w:r>
-        <w:rPr>
-          <w:rFonts w:ascii="Times New Roman" w:hAnsi="Times New Roman"/>
-          <w:sz w:val="24"/>
-        </w:rPr>
-        <w:t xml:space="preserve"> </w:t>
-      </w:r>
-      <w:r>
-        <w:rPr>
-          <w:rFonts w:ascii="Times New Roman" w:hAnsi="Times New Roman"/>
-          <w:sz w:val="24"/>
-        </w:rPr>
-        <w:t>повсякчас,</w:t>
-      </w:r>
-      <w:r>
-        <w:rPr>
-          <w:rFonts w:ascii="Times New Roman" w:hAnsi="Times New Roman"/>
-          <w:sz w:val="24"/>
-        </w:rPr>
-        <w:t xml:space="preserve"> </w:t>
-      </w:r>
-      <w:r>
-        <w:rPr>
-          <w:rFonts w:ascii="Times New Roman" w:hAnsi="Times New Roman"/>
-          <w:sz w:val="24"/>
-        </w:rPr>
-        <w:t>і</w:t>
-      </w:r>
-      <w:r>
-        <w:rPr>
-          <w:rFonts w:ascii="Times New Roman" w:hAnsi="Times New Roman"/>
-          <w:sz w:val="24"/>
-        </w:rPr>
-        <w:t xml:space="preserve"> </w:t>
-      </w:r>
-      <w:r>
-        <w:rPr>
-          <w:rFonts w:ascii="Times New Roman" w:hAnsi="Times New Roman"/>
-          <w:sz w:val="24"/>
-        </w:rPr>
-        <w:t>на</w:t>
-      </w:r>
-      <w:r>
-        <w:rPr>
-          <w:rFonts w:ascii="Times New Roman" w:hAnsi="Times New Roman"/>
-          <w:sz w:val="24"/>
-        </w:rPr>
-        <w:t xml:space="preserve"> </w:t>
-      </w:r>
-      <w:r>
-        <w:rPr>
-          <w:rFonts w:ascii="Times New Roman" w:hAnsi="Times New Roman"/>
-          <w:sz w:val="24"/>
-        </w:rPr>
-        <w:t>віки</w:t>
-      </w:r>
-      <w:r>
-        <w:rPr>
-          <w:rFonts w:ascii="Times New Roman" w:hAnsi="Times New Roman"/>
-          <w:sz w:val="24"/>
-        </w:rPr>
-        <w:t xml:space="preserve"> </w:t>
-      </w:r>
-      <w:r>
-        <w:rPr>
-          <w:rFonts w:ascii="Times New Roman" w:hAnsi="Times New Roman"/>
-          <w:sz w:val="24"/>
-        </w:rPr>
-        <w:t>віків.</w:t>
+        <w:t xml:space="preserve"> Бо Тобі належить усяка слава, честь і поклоніння, Отцю, і Сину, і Святому Духові, нині, і повсякчас, і на віки віків.</w:t>
       </w:r>
     </w:p>
     <w:p>
@@ -40882,7 +39233,7 @@
         <w:rPr>
           <w:rFonts w:ascii="Times New Roman" w:hAnsi="Times New Roman"/>
           <w:i/>
-          <w:color w:val="FF4400"/>
+          <w:color w:val="FF0000"/>
           <w:sz w:val="24"/>
         </w:rPr>
         <w:t>Священник:</w:t>
@@ -40890,402 +39241,9 @@
       <w:r>
         <w:rPr>
           <w:rFonts w:ascii="Times New Roman" w:hAnsi="Times New Roman"/>
-          <w:color w:val="000000"/>
-          <w:sz w:val="24"/>
-        </w:rPr>
-        <w:t xml:space="preserve"> </w:t>
-      </w:r>
-      <w:r>
-        <w:rPr>
-          <w:rFonts w:ascii="Times New Roman" w:hAnsi="Times New Roman"/>
-          <w:color w:val="000000"/>
-          <w:sz w:val="24"/>
-        </w:rPr>
-        <w:t>Бо</w:t>
-      </w:r>
-      <w:r>
-        <w:rPr>
-          <w:rFonts w:ascii="Times New Roman" w:hAnsi="Times New Roman"/>
-          <w:color w:val="000000"/>
-          <w:sz w:val="24"/>
-        </w:rPr>
-        <w:t xml:space="preserve"> </w:t>
-      </w:r>
-      <w:r>
-        <w:rPr>
-          <w:rFonts w:ascii="Times New Roman" w:hAnsi="Times New Roman"/>
-          <w:color w:val="000000"/>
-          <w:sz w:val="24"/>
-        </w:rPr>
-        <w:t>Твоя</w:t>
-      </w:r>
-      <w:r>
-        <w:rPr>
-          <w:rFonts w:ascii="Times New Roman" w:hAnsi="Times New Roman"/>
-          <w:color w:val="000000"/>
-          <w:sz w:val="24"/>
-        </w:rPr>
-        <w:t xml:space="preserve"> </w:t>
-      </w:r>
-      <w:r>
-        <w:rPr>
-          <w:rFonts w:ascii="Times New Roman" w:hAnsi="Times New Roman"/>
-          <w:color w:val="000000"/>
-          <w:sz w:val="24"/>
-        </w:rPr>
-        <w:t>є</w:t>
-      </w:r>
-      <w:r>
-        <w:rPr>
-          <w:rFonts w:ascii="Times New Roman" w:hAnsi="Times New Roman"/>
-          <w:color w:val="000000"/>
-          <w:sz w:val="24"/>
-        </w:rPr>
-        <w:t xml:space="preserve"> </w:t>
-      </w:r>
-      <w:r>
-        <w:rPr>
-          <w:rFonts w:ascii="Times New Roman" w:hAnsi="Times New Roman"/>
-          <w:color w:val="000000"/>
-          <w:sz w:val="24"/>
-        </w:rPr>
-        <w:t>влада</w:t>
-      </w:r>
-      <w:r>
-        <w:rPr>
-          <w:rFonts w:ascii="Times New Roman" w:hAnsi="Times New Roman"/>
-          <w:color w:val="000000"/>
-          <w:sz w:val="24"/>
-        </w:rPr>
-        <w:t xml:space="preserve"> </w:t>
-      </w:r>
-      <w:r>
-        <w:rPr>
-          <w:rFonts w:ascii="Times New Roman" w:hAnsi="Times New Roman"/>
-          <w:color w:val="000000"/>
-          <w:sz w:val="24"/>
-        </w:rPr>
-        <w:t>і</w:t>
-      </w:r>
-      <w:r>
-        <w:rPr>
-          <w:rFonts w:ascii="Times New Roman" w:hAnsi="Times New Roman"/>
-          <w:color w:val="000000"/>
-          <w:sz w:val="24"/>
-        </w:rPr>
-        <w:t xml:space="preserve"> </w:t>
-      </w:r>
-      <w:r>
-        <w:rPr>
-          <w:rFonts w:ascii="Times New Roman" w:hAnsi="Times New Roman"/>
-          <w:color w:val="000000"/>
-          <w:sz w:val="24"/>
-        </w:rPr>
-        <w:t>Твоє</w:t>
-      </w:r>
-      <w:r>
-        <w:rPr>
-          <w:rFonts w:ascii="Times New Roman" w:hAnsi="Times New Roman"/>
-          <w:color w:val="000000"/>
-          <w:sz w:val="24"/>
-        </w:rPr>
-        <w:t xml:space="preserve"> </w:t>
-      </w:r>
-      <w:r>
-        <w:rPr>
-          <w:rFonts w:ascii="Times New Roman" w:hAnsi="Times New Roman"/>
-          <w:color w:val="000000"/>
-          <w:sz w:val="24"/>
-        </w:rPr>
-        <w:t>є</w:t>
-      </w:r>
-      <w:r>
-        <w:rPr>
-          <w:rFonts w:ascii="Times New Roman" w:hAnsi="Times New Roman"/>
-          <w:color w:val="000000"/>
-          <w:sz w:val="24"/>
-        </w:rPr>
-        <w:t xml:space="preserve"> </w:t>
-      </w:r>
-      <w:r>
-        <w:rPr>
-          <w:rFonts w:ascii="Times New Roman" w:hAnsi="Times New Roman"/>
-          <w:color w:val="000000"/>
-          <w:sz w:val="24"/>
-        </w:rPr>
-        <w:t>царство,</w:t>
-      </w:r>
-      <w:r>
-        <w:rPr>
-          <w:rFonts w:ascii="Times New Roman" w:hAnsi="Times New Roman"/>
-          <w:color w:val="000000"/>
-          <w:sz w:val="24"/>
-        </w:rPr>
-        <w:t xml:space="preserve"> </w:t>
-      </w:r>
-      <w:r>
-        <w:rPr>
-          <w:rFonts w:ascii="Times New Roman" w:hAnsi="Times New Roman"/>
-          <w:color w:val="000000"/>
-          <w:sz w:val="24"/>
-        </w:rPr>
-        <w:t>і</w:t>
-      </w:r>
-      <w:r>
-        <w:rPr>
-          <w:rFonts w:ascii="Times New Roman" w:hAnsi="Times New Roman"/>
-          <w:color w:val="000000"/>
-          <w:sz w:val="24"/>
-        </w:rPr>
-        <w:t xml:space="preserve"> </w:t>
-      </w:r>
-      <w:r>
-        <w:rPr>
-          <w:rFonts w:ascii="Times New Roman" w:hAnsi="Times New Roman"/>
-          <w:color w:val="000000"/>
-          <w:sz w:val="24"/>
-        </w:rPr>
-        <w:t>сила,</w:t>
-      </w:r>
-      <w:r>
-        <w:rPr>
-          <w:rFonts w:ascii="Times New Roman" w:hAnsi="Times New Roman"/>
-          <w:color w:val="000000"/>
-          <w:sz w:val="24"/>
-        </w:rPr>
-        <w:t xml:space="preserve"> </w:t>
-      </w:r>
-      <w:r>
-        <w:rPr>
-          <w:rFonts w:ascii="Times New Roman" w:hAnsi="Times New Roman"/>
-          <w:color w:val="000000"/>
-          <w:sz w:val="24"/>
-        </w:rPr>
-        <w:t>і</w:t>
-      </w:r>
-      <w:r>
-        <w:rPr>
-          <w:rFonts w:ascii="Times New Roman" w:hAnsi="Times New Roman"/>
-          <w:color w:val="000000"/>
-          <w:sz w:val="24"/>
-        </w:rPr>
-        <w:t xml:space="preserve"> </w:t>
-      </w:r>
-      <w:r>
-        <w:rPr>
-          <w:rFonts w:ascii="Times New Roman" w:hAnsi="Times New Roman"/>
-          <w:color w:val="000000"/>
-          <w:sz w:val="24"/>
-        </w:rPr>
-        <w:t>слава,</w:t>
-      </w:r>
-      <w:r>
-        <w:rPr>
-          <w:rFonts w:ascii="Times New Roman" w:hAnsi="Times New Roman"/>
-          <w:color w:val="000000"/>
-          <w:sz w:val="24"/>
-        </w:rPr>
-        <w:t xml:space="preserve"> </w:t>
-      </w:r>
-      <w:r>
-        <w:rPr>
-          <w:rFonts w:ascii="Times New Roman" w:hAnsi="Times New Roman"/>
-          <w:color w:val="000000"/>
-          <w:sz w:val="24"/>
-        </w:rPr>
-        <w:t>Отця,</w:t>
-      </w:r>
-      <w:r>
-        <w:rPr>
-          <w:rFonts w:ascii="Times New Roman" w:hAnsi="Times New Roman"/>
-          <w:color w:val="000000"/>
-          <w:sz w:val="24"/>
-        </w:rPr>
-        <w:t xml:space="preserve"> </w:t>
-      </w:r>
-      <w:r>
-        <w:rPr>
-          <w:rFonts w:ascii="Times New Roman" w:hAnsi="Times New Roman"/>
-          <w:color w:val="000000"/>
-          <w:sz w:val="24"/>
-        </w:rPr>
-        <w:t>і</w:t>
-      </w:r>
-      <w:r>
-        <w:rPr>
-          <w:rFonts w:ascii="Times New Roman" w:hAnsi="Times New Roman"/>
-          <w:color w:val="000000"/>
-          <w:sz w:val="24"/>
-        </w:rPr>
-        <w:t xml:space="preserve"> </w:t>
-      </w:r>
-      <w:r>
-        <w:rPr>
-          <w:rFonts w:ascii="Times New Roman" w:hAnsi="Times New Roman"/>
-          <w:color w:val="000000"/>
-          <w:sz w:val="24"/>
-        </w:rPr>
-        <w:t>Сина,</w:t>
-      </w:r>
-      <w:r>
-        <w:rPr>
-          <w:rFonts w:ascii="Times New Roman" w:hAnsi="Times New Roman"/>
-          <w:color w:val="000000"/>
-          <w:sz w:val="24"/>
-        </w:rPr>
-        <w:t xml:space="preserve"> </w:t>
-      </w:r>
-      <w:r>
-        <w:rPr>
-          <w:rFonts w:ascii="Times New Roman" w:hAnsi="Times New Roman"/>
-          <w:color w:val="000000"/>
-          <w:sz w:val="24"/>
-        </w:rPr>
-        <w:t>і</w:t>
-      </w:r>
-      <w:r>
-        <w:rPr>
-          <w:rFonts w:ascii="Times New Roman" w:hAnsi="Times New Roman"/>
-          <w:color w:val="000000"/>
-          <w:sz w:val="24"/>
-        </w:rPr>
-        <w:t xml:space="preserve"> </w:t>
-      </w:r>
-      <w:r>
-        <w:rPr>
-          <w:rFonts w:ascii="Times New Roman" w:hAnsi="Times New Roman"/>
-          <w:color w:val="000000"/>
-          <w:sz w:val="24"/>
-        </w:rPr>
-        <w:t>Святого</w:t>
-      </w:r>
-      <w:r>
-        <w:rPr>
-          <w:rFonts w:ascii="Times New Roman" w:hAnsi="Times New Roman"/>
-          <w:color w:val="000000"/>
-          <w:sz w:val="24"/>
-        </w:rPr>
-        <w:t xml:space="preserve"> </w:t>
-      </w:r>
-      <w:r>
-        <w:rPr>
-          <w:rFonts w:ascii="Times New Roman" w:hAnsi="Times New Roman"/>
-          <w:color w:val="000000"/>
-          <w:sz w:val="24"/>
-        </w:rPr>
-        <w:t>Духа,</w:t>
-      </w:r>
-      <w:r>
-        <w:rPr>
-          <w:rFonts w:ascii="Times New Roman" w:hAnsi="Times New Roman"/>
-          <w:color w:val="000000"/>
-          <w:sz w:val="24"/>
-        </w:rPr>
-        <w:t xml:space="preserve"> </w:t>
-      </w:r>
-      <w:r>
-        <w:rPr>
-          <w:rFonts w:ascii="Times New Roman" w:hAnsi="Times New Roman"/>
-          <w:color w:val="000000"/>
-          <w:sz w:val="24"/>
-        </w:rPr>
-        <w:t>нині,</w:t>
-      </w:r>
-      <w:r>
-        <w:rPr>
-          <w:rFonts w:ascii="Times New Roman" w:hAnsi="Times New Roman"/>
-          <w:color w:val="000000"/>
-          <w:sz w:val="24"/>
-        </w:rPr>
-        <w:t xml:space="preserve"> </w:t>
-      </w:r>
-      <w:r>
-        <w:rPr>
-          <w:rFonts w:ascii="Times New Roman" w:hAnsi="Times New Roman"/>
-          <w:color w:val="000000"/>
-          <w:sz w:val="24"/>
-        </w:rPr>
-        <w:t>і</w:t>
-      </w:r>
-      <w:r>
-        <w:rPr>
-          <w:rFonts w:ascii="Times New Roman" w:hAnsi="Times New Roman"/>
-          <w:color w:val="000000"/>
-          <w:sz w:val="24"/>
-        </w:rPr>
-        <w:t xml:space="preserve"> </w:t>
-      </w:r>
-      <w:r>
-        <w:rPr>
-          <w:rFonts w:ascii="Times New Roman" w:hAnsi="Times New Roman"/>
-          <w:color w:val="000000"/>
-          <w:sz w:val="24"/>
-        </w:rPr>
-        <w:t>повсякчас,</w:t>
-      </w:r>
-      <w:r>
-        <w:rPr>
-          <w:rFonts w:ascii="Times New Roman" w:hAnsi="Times New Roman"/>
-          <w:color w:val="000000"/>
-          <w:sz w:val="24"/>
-        </w:rPr>
-        <w:t xml:space="preserve"> </w:t>
-      </w:r>
-      <w:r>
-        <w:rPr>
-          <w:rFonts w:ascii="Times New Roman" w:hAnsi="Times New Roman"/>
-          <w:color w:val="000000"/>
-          <w:sz w:val="24"/>
-        </w:rPr>
-        <w:t>і</w:t>
-      </w:r>
-      <w:r>
-        <w:rPr>
-          <w:rFonts w:ascii="Times New Roman" w:hAnsi="Times New Roman"/>
-          <w:color w:val="000000"/>
-          <w:sz w:val="24"/>
-        </w:rPr>
-        <w:t xml:space="preserve"> </w:t>
-      </w:r>
-      <w:r>
-        <w:rPr>
-          <w:rFonts w:ascii="Times New Roman" w:hAnsi="Times New Roman"/>
-          <w:color w:val="000000"/>
-          <w:sz w:val="24"/>
-        </w:rPr>
-        <w:t>на</w:t>
-      </w:r>
-      <w:r>
-        <w:rPr>
-          <w:rFonts w:ascii="Times New Roman" w:hAnsi="Times New Roman"/>
-          <w:color w:val="000000"/>
-          <w:sz w:val="24"/>
-        </w:rPr>
-        <w:t xml:space="preserve"> </w:t>
-      </w:r>
-      <w:r>
-        <w:rPr>
-          <w:rFonts w:ascii="Times New Roman" w:hAnsi="Times New Roman"/>
-          <w:color w:val="000000"/>
-          <w:sz w:val="24"/>
-        </w:rPr>
-        <w:t>віки</w:t>
-      </w:r>
-      <w:r>
-        <w:rPr>
-          <w:rFonts w:ascii="Times New Roman" w:hAnsi="Times New Roman"/>
-          <w:color w:val="000000"/>
-          <w:sz w:val="24"/>
-        </w:rPr>
-        <w:t xml:space="preserve"> </w:t>
-      </w:r>
-      <w:r>
-        <w:rPr>
-          <w:rFonts w:ascii="Times New Roman" w:hAnsi="Times New Roman"/>
-          <w:color w:val="000000"/>
-          <w:sz w:val="24"/>
-        </w:rPr>
-        <w:t>віків.</w:t>
+          <w:sz w:val="24"/>
+        </w:rPr>
+        <w:t xml:space="preserve"> Бо Твоя є влада і Твоє є царство, і сила, і слава, Отця, і Сина, і Святого Духа, нині, і повсякчас, і на віки віків.</w:t>
       </w:r>
     </w:p>
     <w:p>
@@ -42359,7 +40317,7 @@
         <w:rPr>
           <w:rFonts w:ascii="Times New Roman" w:hAnsi="Times New Roman"/>
           <w:i/>
-          <w:color w:val="FF4400"/>
+          <w:color w:val="FF0000"/>
           <w:sz w:val="24"/>
         </w:rPr>
         <w:t>Священник:</w:t>
@@ -42367,386 +40325,9 @@
       <w:r>
         <w:rPr>
           <w:rFonts w:ascii="Times New Roman" w:hAnsi="Times New Roman"/>
-          <w:color w:val="000000"/>
-          <w:sz w:val="24"/>
-        </w:rPr>
-        <w:t xml:space="preserve"> </w:t>
-      </w:r>
-      <w:r>
-        <w:rPr>
-          <w:rFonts w:ascii="Times New Roman" w:hAnsi="Times New Roman"/>
-          <w:color w:val="000000"/>
-          <w:sz w:val="24"/>
-        </w:rPr>
-        <w:t>Бо</w:t>
-      </w:r>
-      <w:r>
-        <w:rPr>
-          <w:rFonts w:ascii="Times New Roman" w:hAnsi="Times New Roman"/>
-          <w:color w:val="000000"/>
-          <w:sz w:val="24"/>
-        </w:rPr>
-        <w:t xml:space="preserve"> </w:t>
-      </w:r>
-      <w:r>
-        <w:rPr>
-          <w:rFonts w:ascii="Times New Roman" w:hAnsi="Times New Roman"/>
-          <w:color w:val="000000"/>
-          <w:sz w:val="24"/>
-        </w:rPr>
-        <w:t>Ти</w:t>
-      </w:r>
-      <w:r>
-        <w:rPr>
-          <w:rFonts w:ascii="Times New Roman" w:hAnsi="Times New Roman"/>
-          <w:color w:val="000000"/>
-          <w:sz w:val="24"/>
-        </w:rPr>
-        <w:t xml:space="preserve"> </w:t>
-      </w:r>
-      <w:r>
-        <w:rPr>
-          <w:rFonts w:ascii="Times New Roman" w:hAnsi="Times New Roman"/>
-          <w:color w:val="000000"/>
-          <w:sz w:val="24"/>
-        </w:rPr>
-        <w:t>благий</w:t>
-      </w:r>
-      <w:r>
-        <w:rPr>
-          <w:rFonts w:ascii="Times New Roman" w:hAnsi="Times New Roman"/>
-          <w:color w:val="000000"/>
-          <w:sz w:val="24"/>
-        </w:rPr>
-        <w:t xml:space="preserve"> </w:t>
-      </w:r>
-      <w:r>
-        <w:rPr>
-          <w:rFonts w:ascii="Times New Roman" w:hAnsi="Times New Roman"/>
-          <w:color w:val="000000"/>
-          <w:sz w:val="24"/>
-        </w:rPr>
-        <w:t>і</w:t>
-      </w:r>
-      <w:r>
-        <w:rPr>
-          <w:rFonts w:ascii="Times New Roman" w:hAnsi="Times New Roman"/>
-          <w:color w:val="000000"/>
-          <w:sz w:val="24"/>
-        </w:rPr>
-        <w:t xml:space="preserve"> </w:t>
-      </w:r>
-      <w:r>
-        <w:rPr>
-          <w:rFonts w:ascii="Times New Roman" w:hAnsi="Times New Roman"/>
-          <w:color w:val="000000"/>
-          <w:sz w:val="24"/>
-        </w:rPr>
-        <w:t>людинолюбний</w:t>
-      </w:r>
-      <w:r>
-        <w:rPr>
-          <w:rFonts w:ascii="Times New Roman" w:hAnsi="Times New Roman"/>
-          <w:color w:val="000000"/>
-          <w:sz w:val="24"/>
-        </w:rPr>
-        <w:t xml:space="preserve"> </w:t>
-      </w:r>
-      <w:r>
-        <w:rPr>
-          <w:rFonts w:ascii="Times New Roman" w:hAnsi="Times New Roman"/>
-          <w:color w:val="000000"/>
-          <w:sz w:val="24"/>
-        </w:rPr>
-        <w:t>Бог</w:t>
-      </w:r>
-      <w:r>
-        <w:rPr>
-          <w:rFonts w:ascii="Times New Roman" w:hAnsi="Times New Roman"/>
-          <w:color w:val="000000"/>
-          <w:sz w:val="24"/>
-        </w:rPr>
-        <w:t xml:space="preserve"> </w:t>
-      </w:r>
-      <w:r>
-        <w:rPr>
-          <w:rFonts w:ascii="Times New Roman" w:hAnsi="Times New Roman"/>
-          <w:color w:val="000000"/>
-          <w:sz w:val="24"/>
-        </w:rPr>
-        <w:t>–</w:t>
-      </w:r>
-      <w:r>
-        <w:rPr>
-          <w:rFonts w:ascii="Times New Roman" w:hAnsi="Times New Roman"/>
-          <w:color w:val="000000"/>
-          <w:sz w:val="24"/>
-        </w:rPr>
-        <w:t xml:space="preserve"> </w:t>
-      </w:r>
-      <w:r>
-        <w:rPr>
-          <w:rFonts w:ascii="Times New Roman" w:hAnsi="Times New Roman"/>
-          <w:color w:val="000000"/>
-          <w:sz w:val="24"/>
-        </w:rPr>
-        <w:t>і</w:t>
-      </w:r>
-      <w:r>
-        <w:rPr>
-          <w:rFonts w:ascii="Times New Roman" w:hAnsi="Times New Roman"/>
-          <w:color w:val="000000"/>
-          <w:sz w:val="24"/>
-        </w:rPr>
-        <w:t xml:space="preserve"> </w:t>
-      </w:r>
-      <w:r>
-        <w:rPr>
-          <w:rFonts w:ascii="Times New Roman" w:hAnsi="Times New Roman"/>
-          <w:color w:val="000000"/>
-          <w:sz w:val="24"/>
-        </w:rPr>
-        <w:t>Тобі</w:t>
-      </w:r>
-      <w:r>
-        <w:rPr>
-          <w:rFonts w:ascii="Times New Roman" w:hAnsi="Times New Roman"/>
-          <w:color w:val="000000"/>
-          <w:sz w:val="24"/>
-        </w:rPr>
-        <w:t xml:space="preserve"> </w:t>
-      </w:r>
-      <w:r>
-        <w:rPr>
-          <w:rFonts w:ascii="Times New Roman" w:hAnsi="Times New Roman"/>
-          <w:color w:val="000000"/>
-          <w:sz w:val="24"/>
-        </w:rPr>
-        <w:t>славу</w:t>
-      </w:r>
-      <w:r>
-        <w:rPr>
-          <w:rFonts w:ascii="Times New Roman" w:hAnsi="Times New Roman"/>
-          <w:color w:val="000000"/>
-          <w:sz w:val="24"/>
-        </w:rPr>
-        <w:t xml:space="preserve"> </w:t>
-      </w:r>
-      <w:r>
-        <w:rPr>
-          <w:rFonts w:ascii="Times New Roman" w:hAnsi="Times New Roman"/>
-          <w:color w:val="000000"/>
-          <w:sz w:val="24"/>
-        </w:rPr>
-        <w:t>возсилаємо,</w:t>
-      </w:r>
-      <w:r>
-        <w:rPr>
-          <w:rFonts w:ascii="Times New Roman" w:hAnsi="Times New Roman"/>
-          <w:color w:val="000000"/>
-          <w:sz w:val="24"/>
-        </w:rPr>
-        <w:t xml:space="preserve"> </w:t>
-      </w:r>
-      <w:r>
-        <w:rPr>
-          <w:rFonts w:ascii="Times New Roman" w:hAnsi="Times New Roman"/>
-          <w:color w:val="000000"/>
-          <w:sz w:val="24"/>
-        </w:rPr>
-        <w:t>Отцю,</w:t>
-      </w:r>
-      <w:r>
-        <w:rPr>
-          <w:rFonts w:ascii="Times New Roman" w:hAnsi="Times New Roman"/>
-          <w:color w:val="000000"/>
-          <w:sz w:val="24"/>
-        </w:rPr>
-        <w:t xml:space="preserve"> </w:t>
-      </w:r>
-      <w:r>
-        <w:rPr>
-          <w:rFonts w:ascii="Times New Roman" w:hAnsi="Times New Roman"/>
-          <w:color w:val="000000"/>
-          <w:sz w:val="24"/>
-        </w:rPr>
-        <w:t>і</w:t>
-      </w:r>
-      <w:r>
-        <w:rPr>
-          <w:rFonts w:ascii="Times New Roman" w:hAnsi="Times New Roman"/>
-          <w:color w:val="000000"/>
-          <w:sz w:val="24"/>
-        </w:rPr>
-        <w:t xml:space="preserve"> </w:t>
-      </w:r>
-      <w:r>
-        <w:rPr>
-          <w:rFonts w:ascii="Times New Roman" w:hAnsi="Times New Roman"/>
-          <w:color w:val="000000"/>
-          <w:sz w:val="24"/>
-        </w:rPr>
-        <w:t>Сину,</w:t>
-      </w:r>
-      <w:r>
-        <w:rPr>
-          <w:rFonts w:ascii="Times New Roman" w:hAnsi="Times New Roman"/>
-          <w:color w:val="000000"/>
-          <w:sz w:val="24"/>
-        </w:rPr>
-        <w:t xml:space="preserve"> </w:t>
-      </w:r>
-      <w:r>
-        <w:rPr>
-          <w:rFonts w:ascii="Times New Roman" w:hAnsi="Times New Roman"/>
-          <w:color w:val="000000"/>
-          <w:sz w:val="24"/>
-        </w:rPr>
-        <w:t>і</w:t>
-      </w:r>
-      <w:r>
-        <w:rPr>
-          <w:rFonts w:ascii="Times New Roman" w:hAnsi="Times New Roman"/>
-          <w:color w:val="000000"/>
-          <w:sz w:val="24"/>
-        </w:rPr>
-        <w:t xml:space="preserve"> </w:t>
-      </w:r>
-      <w:r>
-        <w:rPr>
-          <w:rFonts w:ascii="Times New Roman" w:hAnsi="Times New Roman"/>
-          <w:color w:val="000000"/>
-          <w:sz w:val="24"/>
-        </w:rPr>
-        <w:t>Святому</w:t>
-      </w:r>
-      <w:r>
-        <w:rPr>
-          <w:rFonts w:ascii="Times New Roman" w:hAnsi="Times New Roman"/>
-          <w:color w:val="000000"/>
-          <w:sz w:val="24"/>
-        </w:rPr>
-        <w:t xml:space="preserve"> </w:t>
-      </w:r>
-      <w:r>
-        <w:rPr>
-          <w:rFonts w:ascii="Times New Roman" w:hAnsi="Times New Roman"/>
-          <w:color w:val="000000"/>
-          <w:sz w:val="24"/>
-        </w:rPr>
-        <w:t>Духові,</w:t>
-      </w:r>
-      <w:r>
-        <w:rPr>
-          <w:rFonts w:ascii="Times New Roman" w:hAnsi="Times New Roman"/>
-          <w:color w:val="000000"/>
-          <w:sz w:val="24"/>
-        </w:rPr>
-        <w:t xml:space="preserve"> </w:t>
-      </w:r>
-      <w:r>
-        <w:rPr>
-          <w:rFonts w:ascii="Times New Roman" w:hAnsi="Times New Roman"/>
-          <w:color w:val="000000"/>
-          <w:sz w:val="24"/>
-        </w:rPr>
-        <w:t>нині,</w:t>
-      </w:r>
-      <w:r>
-        <w:rPr>
-          <w:rFonts w:ascii="Times New Roman" w:hAnsi="Times New Roman"/>
-          <w:color w:val="000000"/>
-          <w:sz w:val="24"/>
-        </w:rPr>
-        <w:t xml:space="preserve"> </w:t>
-      </w:r>
-      <w:r>
-        <w:rPr>
-          <w:rFonts w:ascii="Times New Roman" w:hAnsi="Times New Roman"/>
-          <w:color w:val="000000"/>
-          <w:sz w:val="24"/>
-        </w:rPr>
-        <w:t>і</w:t>
-      </w:r>
-      <w:r>
-        <w:rPr>
-          <w:rFonts w:ascii="Times New Roman" w:hAnsi="Times New Roman"/>
-          <w:color w:val="000000"/>
-          <w:sz w:val="24"/>
-        </w:rPr>
-        <w:t xml:space="preserve"> </w:t>
-      </w:r>
-      <w:r>
-        <w:rPr>
-          <w:rFonts w:ascii="Times New Roman" w:hAnsi="Times New Roman"/>
-          <w:color w:val="000000"/>
-          <w:sz w:val="24"/>
-        </w:rPr>
-        <w:t>повсякчас,</w:t>
-      </w:r>
-      <w:r>
-        <w:rPr>
-          <w:rFonts w:ascii="Times New Roman" w:hAnsi="Times New Roman"/>
-          <w:color w:val="000000"/>
-          <w:sz w:val="24"/>
-        </w:rPr>
-        <w:t xml:space="preserve"> </w:t>
-      </w:r>
-      <w:r>
-        <w:rPr>
-          <w:rFonts w:ascii="Times New Roman" w:hAnsi="Times New Roman"/>
-          <w:color w:val="000000"/>
-          <w:sz w:val="24"/>
-        </w:rPr>
-        <w:t>і</w:t>
-      </w:r>
-      <w:r>
-        <w:rPr>
-          <w:rFonts w:ascii="Times New Roman" w:hAnsi="Times New Roman"/>
-          <w:color w:val="000000"/>
-          <w:sz w:val="24"/>
-        </w:rPr>
-        <w:t xml:space="preserve"> </w:t>
-      </w:r>
-      <w:r>
-        <w:rPr>
-          <w:rFonts w:ascii="Times New Roman" w:hAnsi="Times New Roman"/>
-          <w:color w:val="000000"/>
-          <w:sz w:val="24"/>
-        </w:rPr>
-        <w:t>на</w:t>
-      </w:r>
-      <w:r>
-        <w:rPr>
-          <w:rFonts w:ascii="Times New Roman" w:hAnsi="Times New Roman"/>
-          <w:color w:val="000000"/>
-          <w:sz w:val="24"/>
-        </w:rPr>
-        <w:t xml:space="preserve"> </w:t>
-      </w:r>
-      <w:r>
-        <w:rPr>
-          <w:rFonts w:ascii="Times New Roman" w:hAnsi="Times New Roman"/>
-          <w:color w:val="000000"/>
-          <w:sz w:val="24"/>
-        </w:rPr>
-        <w:t>віки</w:t>
-      </w:r>
-      <w:r>
-        <w:rPr>
-          <w:rFonts w:ascii="Times New Roman" w:hAnsi="Times New Roman"/>
-          <w:color w:val="000000"/>
-          <w:sz w:val="24"/>
-        </w:rPr>
-        <w:t xml:space="preserve"> </w:t>
-      </w:r>
-      <w:r>
-        <w:rPr>
-          <w:rFonts w:ascii="Times New Roman" w:hAnsi="Times New Roman"/>
-          <w:color w:val="000000"/>
-          <w:sz w:val="24"/>
-        </w:rPr>
-        <w:t>віків.</w:t>
+          <w:sz w:val="24"/>
+        </w:rPr>
+        <w:t xml:space="preserve"> Бо Ти благий і людинолюбний Бог – і Тобі славу возсилаємо, Отцю, і Сину, і Святому Духові, нині, і повсякчас, і на віки віків.</w:t>
       </w:r>
     </w:p>
     <w:p>
@@ -46910,7 +44491,7 @@
         <w:rPr>
           <w:rFonts w:ascii="Times New Roman" w:hAnsi="Times New Roman"/>
           <w:i/>
-          <w:color w:val="FF4400"/>
+          <w:color w:val="FF0000"/>
           <w:sz w:val="24"/>
         </w:rPr>
         <w:t>Священник:</w:t>
@@ -46918,435 +44499,9 @@
       <w:r>
         <w:rPr>
           <w:rFonts w:ascii="Times New Roman" w:hAnsi="Times New Roman"/>
-          <w:i/>
-          <w:color w:val="FF4400"/>
-          <w:sz w:val="24"/>
-        </w:rPr>
-        <w:t xml:space="preserve"> </w:t>
-      </w:r>
-      <w:r>
-        <w:rPr>
-          <w:rFonts w:ascii="Times New Roman" w:hAnsi="Times New Roman"/>
-          <w:color w:val="000000"/>
-          <w:sz w:val="24"/>
-        </w:rPr>
-        <w:t>Благодаттю,</w:t>
-      </w:r>
-      <w:r>
-        <w:rPr>
-          <w:rFonts w:ascii="Times New Roman" w:hAnsi="Times New Roman"/>
-          <w:color w:val="000000"/>
-          <w:sz w:val="24"/>
-        </w:rPr>
-        <w:t xml:space="preserve"> </w:t>
-      </w:r>
-      <w:r>
-        <w:rPr>
-          <w:rFonts w:ascii="Times New Roman" w:hAnsi="Times New Roman"/>
-          <w:color w:val="000000"/>
-          <w:sz w:val="24"/>
-        </w:rPr>
-        <w:t>і</w:t>
-      </w:r>
-      <w:r>
-        <w:rPr>
-          <w:rFonts w:ascii="Times New Roman" w:hAnsi="Times New Roman"/>
-          <w:color w:val="000000"/>
-          <w:sz w:val="24"/>
-        </w:rPr>
-        <w:t xml:space="preserve"> </w:t>
-      </w:r>
-      <w:r>
-        <w:rPr>
-          <w:rFonts w:ascii="Times New Roman" w:hAnsi="Times New Roman"/>
-          <w:color w:val="000000"/>
-          <w:sz w:val="24"/>
-        </w:rPr>
-        <w:t>щедротами,</w:t>
-      </w:r>
-      <w:r>
-        <w:rPr>
-          <w:rFonts w:ascii="Times New Roman" w:hAnsi="Times New Roman"/>
-          <w:color w:val="000000"/>
-          <w:sz w:val="24"/>
-        </w:rPr>
-        <w:t xml:space="preserve"> </w:t>
-      </w:r>
-      <w:r>
-        <w:rPr>
-          <w:rFonts w:ascii="Times New Roman" w:hAnsi="Times New Roman"/>
-          <w:color w:val="000000"/>
-          <w:sz w:val="24"/>
-        </w:rPr>
-        <w:t>і</w:t>
-      </w:r>
-      <w:r>
-        <w:rPr>
-          <w:rFonts w:ascii="Times New Roman" w:hAnsi="Times New Roman"/>
-          <w:color w:val="000000"/>
-          <w:sz w:val="24"/>
-        </w:rPr>
-        <w:t xml:space="preserve"> </w:t>
-      </w:r>
-      <w:r>
-        <w:rPr>
-          <w:rFonts w:ascii="Times New Roman" w:hAnsi="Times New Roman"/>
-          <w:color w:val="000000"/>
-          <w:sz w:val="24"/>
-        </w:rPr>
-        <w:t>людинолюб’ям</w:t>
-      </w:r>
-      <w:r>
-        <w:rPr>
-          <w:rFonts w:ascii="Times New Roman" w:hAnsi="Times New Roman"/>
-          <w:color w:val="000000"/>
-          <w:sz w:val="24"/>
-        </w:rPr>
-        <w:t xml:space="preserve"> </w:t>
-      </w:r>
-      <w:r>
-        <w:rPr>
-          <w:rFonts w:ascii="Times New Roman" w:hAnsi="Times New Roman"/>
-          <w:color w:val="000000"/>
-          <w:sz w:val="24"/>
-        </w:rPr>
-        <w:t>єдинородного</w:t>
-      </w:r>
-      <w:r>
-        <w:rPr>
-          <w:rFonts w:ascii="Times New Roman" w:hAnsi="Times New Roman"/>
-          <w:color w:val="000000"/>
-          <w:sz w:val="24"/>
-        </w:rPr>
-        <w:t xml:space="preserve"> </w:t>
-      </w:r>
-      <w:r>
-        <w:rPr>
-          <w:rFonts w:ascii="Times New Roman" w:hAnsi="Times New Roman"/>
-          <w:color w:val="000000"/>
-          <w:sz w:val="24"/>
-        </w:rPr>
-        <w:t>Сина</w:t>
-      </w:r>
-      <w:r>
-        <w:rPr>
-          <w:rFonts w:ascii="Times New Roman" w:hAnsi="Times New Roman"/>
-          <w:color w:val="000000"/>
-          <w:sz w:val="24"/>
-        </w:rPr>
-        <w:t xml:space="preserve"> </w:t>
-      </w:r>
-      <w:r>
-        <w:rPr>
-          <w:rFonts w:ascii="Times New Roman" w:hAnsi="Times New Roman"/>
-          <w:color w:val="000000"/>
-          <w:sz w:val="24"/>
-        </w:rPr>
-        <w:t>Твого,</w:t>
-      </w:r>
-      <w:r>
-        <w:rPr>
-          <w:rFonts w:ascii="Times New Roman" w:hAnsi="Times New Roman"/>
-          <w:color w:val="000000"/>
-          <w:sz w:val="24"/>
-        </w:rPr>
-        <w:t xml:space="preserve"> </w:t>
-      </w:r>
-      <w:r>
-        <w:rPr>
-          <w:rFonts w:ascii="Times New Roman" w:hAnsi="Times New Roman"/>
-          <w:color w:val="000000"/>
-          <w:sz w:val="24"/>
-        </w:rPr>
-        <w:t>з</w:t>
-      </w:r>
-      <w:r>
-        <w:rPr>
-          <w:rFonts w:ascii="Times New Roman" w:hAnsi="Times New Roman"/>
-          <w:color w:val="000000"/>
-          <w:sz w:val="24"/>
-        </w:rPr>
-        <w:t xml:space="preserve"> </w:t>
-      </w:r>
-      <w:r>
-        <w:rPr>
-          <w:rFonts w:ascii="Times New Roman" w:hAnsi="Times New Roman"/>
-          <w:color w:val="000000"/>
-          <w:sz w:val="24"/>
-        </w:rPr>
-        <w:t>яким</w:t>
-      </w:r>
-      <w:r>
-        <w:rPr>
-          <w:rFonts w:ascii="Times New Roman" w:hAnsi="Times New Roman"/>
-          <w:color w:val="000000"/>
-          <w:sz w:val="24"/>
-        </w:rPr>
-        <w:t xml:space="preserve"> </w:t>
-      </w:r>
-      <w:r>
-        <w:rPr>
-          <w:rFonts w:ascii="Times New Roman" w:hAnsi="Times New Roman"/>
-          <w:color w:val="000000"/>
-          <w:sz w:val="24"/>
-        </w:rPr>
-        <w:t>Ти</w:t>
-      </w:r>
-      <w:r>
-        <w:rPr>
-          <w:rFonts w:ascii="Times New Roman" w:hAnsi="Times New Roman"/>
-          <w:color w:val="000000"/>
-          <w:sz w:val="24"/>
-        </w:rPr>
-        <w:t xml:space="preserve"> </w:t>
-      </w:r>
-      <w:r>
-        <w:rPr>
-          <w:rFonts w:ascii="Times New Roman" w:hAnsi="Times New Roman"/>
-          <w:color w:val="000000"/>
-          <w:sz w:val="24"/>
-        </w:rPr>
-        <w:t>благословенний,</w:t>
-      </w:r>
-      <w:r>
-        <w:rPr>
-          <w:rFonts w:ascii="Times New Roman" w:hAnsi="Times New Roman"/>
-          <w:color w:val="000000"/>
-          <w:sz w:val="24"/>
-        </w:rPr>
-        <w:t xml:space="preserve"> </w:t>
-      </w:r>
-      <w:r>
-        <w:rPr>
-          <w:rFonts w:ascii="Times New Roman" w:hAnsi="Times New Roman"/>
-          <w:color w:val="000000"/>
-          <w:sz w:val="24"/>
-        </w:rPr>
-        <w:t>із</w:t>
-      </w:r>
-      <w:r>
-        <w:rPr>
-          <w:rFonts w:ascii="Times New Roman" w:hAnsi="Times New Roman"/>
-          <w:color w:val="000000"/>
-          <w:sz w:val="24"/>
-        </w:rPr>
-        <w:t xml:space="preserve"> </w:t>
-      </w:r>
-      <w:r>
-        <w:rPr>
-          <w:rFonts w:ascii="Times New Roman" w:hAnsi="Times New Roman"/>
-          <w:color w:val="000000"/>
-          <w:sz w:val="24"/>
-        </w:rPr>
-        <w:t>пресвятим,</w:t>
-      </w:r>
-      <w:r>
-        <w:rPr>
-          <w:rFonts w:ascii="Times New Roman" w:hAnsi="Times New Roman"/>
-          <w:color w:val="000000"/>
-          <w:sz w:val="24"/>
-        </w:rPr>
-        <w:t xml:space="preserve"> </w:t>
-      </w:r>
-      <w:r>
-        <w:rPr>
-          <w:rFonts w:ascii="Times New Roman" w:hAnsi="Times New Roman"/>
-          <w:color w:val="000000"/>
-          <w:sz w:val="24"/>
-        </w:rPr>
-        <w:t>і</w:t>
-      </w:r>
-      <w:r>
-        <w:rPr>
-          <w:rFonts w:ascii="Times New Roman" w:hAnsi="Times New Roman"/>
-          <w:color w:val="000000"/>
-          <w:sz w:val="24"/>
-        </w:rPr>
-        <w:t xml:space="preserve"> </w:t>
-      </w:r>
-      <w:r>
-        <w:rPr>
-          <w:rFonts w:ascii="Times New Roman" w:hAnsi="Times New Roman"/>
-          <w:color w:val="000000"/>
-          <w:sz w:val="24"/>
-        </w:rPr>
-        <w:t>благим,</w:t>
-      </w:r>
-      <w:r>
-        <w:rPr>
-          <w:rFonts w:ascii="Times New Roman" w:hAnsi="Times New Roman"/>
-          <w:color w:val="000000"/>
-          <w:sz w:val="24"/>
-        </w:rPr>
-        <w:t xml:space="preserve"> </w:t>
-      </w:r>
-      <w:r>
-        <w:rPr>
-          <w:rFonts w:ascii="Times New Roman" w:hAnsi="Times New Roman"/>
-          <w:color w:val="000000"/>
-          <w:sz w:val="24"/>
-        </w:rPr>
-        <w:t>і</w:t>
-      </w:r>
-      <w:r>
-        <w:rPr>
-          <w:rFonts w:ascii="Times New Roman" w:hAnsi="Times New Roman"/>
-          <w:color w:val="000000"/>
-          <w:sz w:val="24"/>
-        </w:rPr>
-        <w:t xml:space="preserve"> </w:t>
-      </w:r>
-      <w:r>
-        <w:rPr>
-          <w:rFonts w:ascii="Times New Roman" w:hAnsi="Times New Roman"/>
-          <w:color w:val="000000"/>
-          <w:sz w:val="24"/>
-        </w:rPr>
-        <w:t>животворчим</w:t>
-      </w:r>
-      <w:r>
-        <w:rPr>
-          <w:rFonts w:ascii="Times New Roman" w:hAnsi="Times New Roman"/>
-          <w:color w:val="000000"/>
-          <w:sz w:val="24"/>
-        </w:rPr>
-        <w:t xml:space="preserve"> </w:t>
-      </w:r>
-      <w:r>
-        <w:rPr>
-          <w:rFonts w:ascii="Times New Roman" w:hAnsi="Times New Roman"/>
-          <w:color w:val="000000"/>
-          <w:sz w:val="24"/>
-        </w:rPr>
-        <w:t>твоїм</w:t>
-      </w:r>
-      <w:r>
-        <w:rPr>
-          <w:rFonts w:ascii="Times New Roman" w:hAnsi="Times New Roman"/>
-          <w:color w:val="000000"/>
-          <w:sz w:val="24"/>
-        </w:rPr>
-        <w:t xml:space="preserve"> </w:t>
-      </w:r>
-      <w:r>
-        <w:rPr>
-          <w:rFonts w:ascii="Times New Roman" w:hAnsi="Times New Roman"/>
-          <w:color w:val="000000"/>
-          <w:sz w:val="24"/>
-        </w:rPr>
-        <w:t>Духом,</w:t>
-      </w:r>
-      <w:r>
-        <w:rPr>
-          <w:rFonts w:ascii="Times New Roman" w:hAnsi="Times New Roman"/>
-          <w:color w:val="000000"/>
-          <w:sz w:val="24"/>
-        </w:rPr>
-        <w:t xml:space="preserve"> </w:t>
-      </w:r>
-      <w:r>
-        <w:rPr>
-          <w:rFonts w:ascii="Times New Roman" w:hAnsi="Times New Roman"/>
-          <w:color w:val="000000"/>
-          <w:sz w:val="24"/>
-        </w:rPr>
-        <w:t>нині,</w:t>
-      </w:r>
-      <w:r>
-        <w:rPr>
-          <w:rFonts w:ascii="Times New Roman" w:hAnsi="Times New Roman"/>
-          <w:color w:val="000000"/>
-          <w:sz w:val="24"/>
-        </w:rPr>
-        <w:t xml:space="preserve"> </w:t>
-      </w:r>
-      <w:r>
-        <w:rPr>
-          <w:rFonts w:ascii="Times New Roman" w:hAnsi="Times New Roman"/>
-          <w:color w:val="000000"/>
-          <w:sz w:val="24"/>
-        </w:rPr>
-        <w:t>і</w:t>
-      </w:r>
-      <w:r>
-        <w:rPr>
-          <w:rFonts w:ascii="Times New Roman" w:hAnsi="Times New Roman"/>
-          <w:color w:val="000000"/>
-          <w:sz w:val="24"/>
-        </w:rPr>
-        <w:t xml:space="preserve"> </w:t>
-      </w:r>
-      <w:r>
-        <w:rPr>
-          <w:rFonts w:ascii="Times New Roman" w:hAnsi="Times New Roman"/>
-          <w:color w:val="000000"/>
-          <w:sz w:val="24"/>
-        </w:rPr>
-        <w:t>повсякчас,</w:t>
-      </w:r>
-      <w:r>
-        <w:rPr>
-          <w:rFonts w:ascii="Times New Roman" w:hAnsi="Times New Roman"/>
-          <w:color w:val="000000"/>
-          <w:sz w:val="24"/>
-        </w:rPr>
-        <w:t xml:space="preserve"> </w:t>
-      </w:r>
-      <w:r>
-        <w:rPr>
-          <w:rFonts w:ascii="Times New Roman" w:hAnsi="Times New Roman"/>
-          <w:color w:val="000000"/>
-          <w:sz w:val="24"/>
-        </w:rPr>
-        <w:t>і</w:t>
-      </w:r>
-      <w:r>
-        <w:rPr>
-          <w:rFonts w:ascii="Times New Roman" w:hAnsi="Times New Roman"/>
-          <w:color w:val="000000"/>
-          <w:sz w:val="24"/>
-        </w:rPr>
-        <w:t xml:space="preserve"> </w:t>
-      </w:r>
-      <w:r>
-        <w:rPr>
-          <w:rFonts w:ascii="Times New Roman" w:hAnsi="Times New Roman"/>
-          <w:color w:val="000000"/>
-          <w:sz w:val="24"/>
-        </w:rPr>
-        <w:t>на</w:t>
-      </w:r>
-      <w:r>
-        <w:rPr>
-          <w:rFonts w:ascii="Times New Roman" w:hAnsi="Times New Roman"/>
-          <w:color w:val="000000"/>
-          <w:sz w:val="24"/>
-        </w:rPr>
-        <w:t xml:space="preserve"> </w:t>
-      </w:r>
-      <w:r>
-        <w:rPr>
-          <w:rFonts w:ascii="Times New Roman" w:hAnsi="Times New Roman"/>
-          <w:color w:val="000000"/>
-          <w:sz w:val="24"/>
-        </w:rPr>
-        <w:t>віки</w:t>
-      </w:r>
-      <w:r>
-        <w:rPr>
-          <w:rFonts w:ascii="Times New Roman" w:hAnsi="Times New Roman"/>
-          <w:color w:val="000000"/>
-          <w:sz w:val="24"/>
-        </w:rPr>
-        <w:t xml:space="preserve"> </w:t>
-      </w:r>
-      <w:r>
-        <w:rPr>
-          <w:rFonts w:ascii="Times New Roman" w:hAnsi="Times New Roman"/>
-          <w:color w:val="000000"/>
-          <w:sz w:val="24"/>
-        </w:rPr>
-        <w:t>віків.</w:t>
+          <w:sz w:val="24"/>
+        </w:rPr>
+        <w:t xml:space="preserve"> Благодаттю, і щедротами, і людинолюб’ям єдинородного Сина Твого, з яким Ти благословенний, із пресвятим, і благим, і животворчим твоїм Духом, нині, і повсякчас, і на віки віків.</w:t>
       </w:r>
     </w:p>
     <w:p>
@@ -48620,332 +45775,9 @@
       <w:r>
         <w:rPr>
           <w:rFonts w:ascii="Times New Roman" w:hAnsi="Times New Roman"/>
-          <w:i/>
-          <w:color w:val="FF0000"/>
-          <w:sz w:val="24"/>
-        </w:rPr>
-        <w:t xml:space="preserve"> </w:t>
-      </w:r>
-      <w:r>
-        <w:rPr>
-          <w:rFonts w:ascii="Times New Roman" w:hAnsi="Times New Roman"/>
-          <w:color w:val="000000"/>
-          <w:sz w:val="24"/>
-        </w:rPr>
-        <w:t>Бо</w:t>
-      </w:r>
-      <w:r>
-        <w:rPr>
-          <w:rFonts w:ascii="Times New Roman" w:hAnsi="Times New Roman"/>
-          <w:color w:val="000000"/>
-          <w:sz w:val="24"/>
-        </w:rPr>
-        <w:t xml:space="preserve"> </w:t>
-      </w:r>
-      <w:r>
-        <w:rPr>
-          <w:rFonts w:ascii="Times New Roman" w:hAnsi="Times New Roman"/>
-          <w:color w:val="000000"/>
-          <w:sz w:val="24"/>
-        </w:rPr>
-        <w:t>Ти</w:t>
-      </w:r>
-      <w:r>
-        <w:rPr>
-          <w:rFonts w:ascii="Times New Roman" w:hAnsi="Times New Roman"/>
-          <w:color w:val="000000"/>
-          <w:sz w:val="24"/>
-        </w:rPr>
-        <w:t xml:space="preserve"> </w:t>
-      </w:r>
-      <w:r>
-        <w:rPr>
-          <w:rFonts w:ascii="Times New Roman" w:hAnsi="Times New Roman"/>
-          <w:color w:val="000000"/>
-          <w:sz w:val="24"/>
-        </w:rPr>
-        <w:t>Бог</w:t>
-      </w:r>
-      <w:r>
-        <w:rPr>
-          <w:rFonts w:ascii="Times New Roman" w:hAnsi="Times New Roman"/>
-          <w:color w:val="000000"/>
-          <w:sz w:val="24"/>
-        </w:rPr>
-        <w:t xml:space="preserve"> </w:t>
-      </w:r>
-      <w:r>
-        <w:rPr>
-          <w:rFonts w:ascii="Times New Roman" w:hAnsi="Times New Roman"/>
-          <w:color w:val="000000"/>
-          <w:sz w:val="24"/>
-        </w:rPr>
-        <w:t>наш</w:t>
-      </w:r>
-      <w:r>
-        <w:rPr>
-          <w:rFonts w:ascii="Times New Roman" w:hAnsi="Times New Roman"/>
-          <w:color w:val="000000"/>
-          <w:sz w:val="24"/>
-        </w:rPr>
-        <w:t xml:space="preserve"> </w:t>
-      </w:r>
-      <w:r>
-        <w:rPr>
-          <w:rFonts w:ascii="Times New Roman" w:hAnsi="Times New Roman"/>
-          <w:color w:val="000000"/>
-          <w:sz w:val="24"/>
-        </w:rPr>
-        <w:t>і</w:t>
-      </w:r>
-      <w:r>
-        <w:rPr>
-          <w:rFonts w:ascii="Times New Roman" w:hAnsi="Times New Roman"/>
-          <w:color w:val="000000"/>
-          <w:sz w:val="24"/>
-        </w:rPr>
-        <w:t xml:space="preserve"> </w:t>
-      </w:r>
-      <w:r>
-        <w:rPr>
-          <w:rFonts w:ascii="Times New Roman" w:hAnsi="Times New Roman"/>
-          <w:color w:val="000000"/>
-          <w:sz w:val="24"/>
-        </w:rPr>
-        <w:t>Тобі</w:t>
-      </w:r>
-      <w:r>
-        <w:rPr>
-          <w:rFonts w:ascii="Times New Roman" w:hAnsi="Times New Roman"/>
-          <w:color w:val="000000"/>
-          <w:sz w:val="24"/>
-        </w:rPr>
-        <w:t xml:space="preserve"> </w:t>
-      </w:r>
-      <w:r>
-        <w:rPr>
-          <w:rFonts w:ascii="Times New Roman" w:hAnsi="Times New Roman"/>
-          <w:color w:val="000000"/>
-          <w:sz w:val="24"/>
-        </w:rPr>
-        <w:t>славу</w:t>
-      </w:r>
-      <w:r>
-        <w:rPr>
-          <w:rFonts w:ascii="Times New Roman" w:hAnsi="Times New Roman"/>
-          <w:color w:val="000000"/>
-          <w:sz w:val="24"/>
-        </w:rPr>
-        <w:t xml:space="preserve"> </w:t>
-      </w:r>
-      <w:r>
-        <w:rPr>
-          <w:rFonts w:ascii="Times New Roman" w:hAnsi="Times New Roman"/>
-          <w:color w:val="000000"/>
-          <w:sz w:val="24"/>
-        </w:rPr>
-        <w:t>возсилаємо:</w:t>
-      </w:r>
-      <w:r>
-        <w:rPr>
-          <w:rFonts w:ascii="Times New Roman" w:hAnsi="Times New Roman"/>
-          <w:color w:val="000000"/>
-          <w:sz w:val="24"/>
-        </w:rPr>
-        <w:t xml:space="preserve"> </w:t>
-      </w:r>
-      <w:r>
-        <w:rPr>
-          <w:rFonts w:ascii="Times New Roman" w:hAnsi="Times New Roman"/>
-          <w:color w:val="000000"/>
-          <w:sz w:val="24"/>
-        </w:rPr>
-        <w:t>Отцю,</w:t>
-      </w:r>
-      <w:r>
-        <w:rPr>
-          <w:rFonts w:ascii="Times New Roman" w:hAnsi="Times New Roman"/>
-          <w:color w:val="000000"/>
-          <w:sz w:val="24"/>
-        </w:rPr>
-        <w:t xml:space="preserve"> </w:t>
-      </w:r>
-      <w:r>
-        <w:rPr>
-          <w:rFonts w:ascii="Times New Roman" w:hAnsi="Times New Roman"/>
-          <w:color w:val="000000"/>
-          <w:sz w:val="24"/>
-        </w:rPr>
-        <w:t>і</w:t>
-      </w:r>
-      <w:r>
-        <w:rPr>
-          <w:rFonts w:ascii="Times New Roman" w:hAnsi="Times New Roman"/>
-          <w:color w:val="000000"/>
-          <w:sz w:val="24"/>
-        </w:rPr>
-        <w:t xml:space="preserve"> </w:t>
-      </w:r>
-      <w:r>
-        <w:rPr>
-          <w:rFonts w:ascii="Times New Roman" w:hAnsi="Times New Roman"/>
-          <w:color w:val="000000"/>
-          <w:sz w:val="24"/>
-        </w:rPr>
-        <w:t>Сину,</w:t>
-      </w:r>
-      <w:r>
-        <w:rPr>
-          <w:rFonts w:ascii="Times New Roman" w:hAnsi="Times New Roman"/>
-          <w:color w:val="000000"/>
-          <w:sz w:val="24"/>
-        </w:rPr>
-        <w:t xml:space="preserve"> </w:t>
-      </w:r>
-      <w:r>
-        <w:rPr>
-          <w:rFonts w:ascii="Times New Roman" w:hAnsi="Times New Roman"/>
-          <w:color w:val="000000"/>
-          <w:sz w:val="24"/>
-        </w:rPr>
-        <w:t>і</w:t>
-      </w:r>
-      <w:r>
-        <w:rPr>
-          <w:rFonts w:ascii="Times New Roman" w:hAnsi="Times New Roman"/>
-          <w:color w:val="000000"/>
-          <w:sz w:val="24"/>
-        </w:rPr>
-        <w:t xml:space="preserve"> </w:t>
-      </w:r>
-      <w:r>
-        <w:rPr>
-          <w:rFonts w:ascii="Times New Roman" w:hAnsi="Times New Roman"/>
-          <w:color w:val="000000"/>
-          <w:sz w:val="24"/>
-        </w:rPr>
-        <w:t>Святому</w:t>
-      </w:r>
-      <w:r>
-        <w:rPr>
-          <w:rFonts w:ascii="Times New Roman" w:hAnsi="Times New Roman"/>
-          <w:color w:val="000000"/>
-          <w:sz w:val="24"/>
-        </w:rPr>
-        <w:t xml:space="preserve"> </w:t>
-      </w:r>
-      <w:r>
-        <w:rPr>
-          <w:rFonts w:ascii="Times New Roman" w:hAnsi="Times New Roman"/>
-          <w:color w:val="000000"/>
-          <w:sz w:val="24"/>
-        </w:rPr>
-        <w:t>Духові</w:t>
-      </w:r>
-      <w:r>
-        <w:rPr>
-          <w:rFonts w:ascii="Times New Roman" w:hAnsi="Times New Roman"/>
-          <w:sz w:val="24"/>
-        </w:rPr>
-        <w:t>,</w:t>
-      </w:r>
-      <w:r>
-        <w:rPr>
-          <w:rFonts w:ascii="Times New Roman" w:hAnsi="Times New Roman"/>
-          <w:sz w:val="24"/>
-        </w:rPr>
-        <w:t xml:space="preserve"> </w:t>
-      </w:r>
-      <w:r>
-        <w:rPr>
-          <w:rFonts w:ascii="Times New Roman" w:hAnsi="Times New Roman"/>
-          <w:sz w:val="24"/>
-        </w:rPr>
-        <w:t>нині,</w:t>
-      </w:r>
-      <w:r>
-        <w:rPr>
-          <w:rFonts w:ascii="Times New Roman" w:hAnsi="Times New Roman"/>
-          <w:sz w:val="24"/>
-        </w:rPr>
-        <w:t xml:space="preserve"> </w:t>
-      </w:r>
-      <w:r>
-        <w:rPr>
-          <w:rFonts w:ascii="Times New Roman" w:hAnsi="Times New Roman"/>
-          <w:sz w:val="24"/>
-        </w:rPr>
-        <w:t>і</w:t>
-      </w:r>
-      <w:r>
-        <w:rPr>
-          <w:rFonts w:ascii="Times New Roman" w:hAnsi="Times New Roman"/>
-          <w:sz w:val="24"/>
-        </w:rPr>
-        <w:t xml:space="preserve"> </w:t>
-      </w:r>
-      <w:r>
-        <w:rPr>
-          <w:rFonts w:ascii="Times New Roman" w:hAnsi="Times New Roman"/>
-          <w:sz w:val="24"/>
-        </w:rPr>
-        <w:t>повсякчас,</w:t>
-      </w:r>
-      <w:r>
-        <w:rPr>
-          <w:rFonts w:ascii="Times New Roman" w:hAnsi="Times New Roman"/>
-          <w:sz w:val="24"/>
-        </w:rPr>
-        <w:t xml:space="preserve"> </w:t>
-      </w:r>
-      <w:r>
-        <w:rPr>
-          <w:rFonts w:ascii="Times New Roman" w:hAnsi="Times New Roman"/>
-          <w:sz w:val="24"/>
-        </w:rPr>
-        <w:t>і</w:t>
-      </w:r>
-      <w:r>
-        <w:rPr>
-          <w:rFonts w:ascii="Times New Roman" w:hAnsi="Times New Roman"/>
-          <w:sz w:val="24"/>
-        </w:rPr>
-        <w:t xml:space="preserve"> </w:t>
-      </w:r>
-      <w:r>
-        <w:rPr>
-          <w:rFonts w:ascii="Times New Roman" w:hAnsi="Times New Roman"/>
-          <w:sz w:val="24"/>
-        </w:rPr>
-        <w:t>на</w:t>
-      </w:r>
-      <w:r>
-        <w:rPr>
-          <w:rFonts w:ascii="Times New Roman" w:hAnsi="Times New Roman"/>
-          <w:sz w:val="24"/>
-        </w:rPr>
-        <w:t xml:space="preserve"> </w:t>
-      </w:r>
-      <w:r>
-        <w:rPr>
-          <w:rFonts w:ascii="Times New Roman" w:hAnsi="Times New Roman"/>
-          <w:sz w:val="24"/>
-        </w:rPr>
-        <w:t>віки</w:t>
-      </w:r>
-      <w:r>
-        <w:rPr>
-          <w:rFonts w:ascii="Times New Roman" w:hAnsi="Times New Roman"/>
-          <w:sz w:val="24"/>
-        </w:rPr>
-        <w:t xml:space="preserve"> </w:t>
-      </w:r>
-      <w:r>
-        <w:rPr>
-          <w:rFonts w:ascii="Times New Roman" w:hAnsi="Times New Roman"/>
-          <w:sz w:val="24"/>
-        </w:rPr>
-        <w:t>віків.</w:t>
+          <w:sz w:val="24"/>
+        </w:rPr>
+        <w:t xml:space="preserve"> Бо Ти Бог наш і Тобі славу возсилаємо: Отцю, і Сину, і Святому Духові, нині, і повсякчас, і на віки віків.</w:t>
       </w:r>
     </w:p>
     <w:p>
@@ -50470,412 +47302,9 @@
       <w:r>
         <w:rPr>
           <w:rFonts w:ascii="Times New Roman" w:hAnsi="Times New Roman"/>
-          <w:i/>
-          <w:color w:val="FF0000"/>
-          <w:sz w:val="24"/>
-        </w:rPr>
-        <w:t xml:space="preserve"> </w:t>
-      </w:r>
-      <w:r>
-        <w:rPr>
-          <w:rFonts w:ascii="Times New Roman" w:hAnsi="Times New Roman"/>
-          <w:color w:val="000000"/>
-          <w:sz w:val="24"/>
-        </w:rPr>
-        <w:t>Бо</w:t>
-      </w:r>
-      <w:r>
-        <w:rPr>
-          <w:rFonts w:ascii="Times New Roman" w:hAnsi="Times New Roman"/>
-          <w:color w:val="000000"/>
-          <w:sz w:val="24"/>
-        </w:rPr>
-        <w:t xml:space="preserve"> </w:t>
-      </w:r>
-      <w:r>
-        <w:rPr>
-          <w:rFonts w:ascii="Times New Roman" w:hAnsi="Times New Roman"/>
-          <w:color w:val="000000"/>
-          <w:sz w:val="24"/>
-        </w:rPr>
-        <w:t>Ти</w:t>
-      </w:r>
-      <w:r>
-        <w:rPr>
-          <w:rFonts w:ascii="Times New Roman" w:hAnsi="Times New Roman"/>
-          <w:color w:val="000000"/>
-          <w:sz w:val="24"/>
-        </w:rPr>
-        <w:t xml:space="preserve"> </w:t>
-      </w:r>
-      <w:r>
-        <w:rPr>
-          <w:rFonts w:ascii="Times New Roman" w:hAnsi="Times New Roman"/>
-          <w:color w:val="000000"/>
-          <w:sz w:val="24"/>
-        </w:rPr>
-        <w:t>цар</w:t>
-      </w:r>
-      <w:r>
-        <w:rPr>
-          <w:rFonts w:ascii="Times New Roman" w:hAnsi="Times New Roman"/>
-          <w:color w:val="000000"/>
-          <w:sz w:val="24"/>
-        </w:rPr>
-        <w:t xml:space="preserve"> </w:t>
-      </w:r>
-      <w:r>
-        <w:rPr>
-          <w:rFonts w:ascii="Times New Roman" w:hAnsi="Times New Roman"/>
-          <w:color w:val="000000"/>
-          <w:sz w:val="24"/>
-        </w:rPr>
-        <w:t>миру</w:t>
-      </w:r>
-      <w:r>
-        <w:rPr>
-          <w:rFonts w:ascii="Times New Roman" w:hAnsi="Times New Roman"/>
-          <w:color w:val="000000"/>
-          <w:sz w:val="24"/>
-        </w:rPr>
-        <w:t xml:space="preserve"> </w:t>
-      </w:r>
-      <w:r>
-        <w:rPr>
-          <w:rFonts w:ascii="Times New Roman" w:hAnsi="Times New Roman"/>
-          <w:color w:val="000000"/>
-          <w:sz w:val="24"/>
-        </w:rPr>
-        <w:t>і</w:t>
-      </w:r>
-      <w:r>
-        <w:rPr>
-          <w:rFonts w:ascii="Times New Roman" w:hAnsi="Times New Roman"/>
-          <w:color w:val="000000"/>
-          <w:sz w:val="24"/>
-        </w:rPr>
-        <w:t xml:space="preserve"> </w:t>
-      </w:r>
-      <w:r>
-        <w:rPr>
-          <w:rFonts w:ascii="Times New Roman" w:hAnsi="Times New Roman"/>
-          <w:color w:val="000000"/>
-          <w:sz w:val="24"/>
-        </w:rPr>
-        <w:t>Спас</w:t>
-      </w:r>
-      <w:r>
-        <w:rPr>
-          <w:rFonts w:ascii="Times New Roman" w:hAnsi="Times New Roman"/>
-          <w:color w:val="000000"/>
-          <w:sz w:val="24"/>
-        </w:rPr>
-        <w:t xml:space="preserve"> </w:t>
-      </w:r>
-      <w:r>
-        <w:rPr>
-          <w:rFonts w:ascii="Times New Roman" w:hAnsi="Times New Roman"/>
-          <w:color w:val="000000"/>
-          <w:sz w:val="24"/>
-        </w:rPr>
-        <w:t>душ</w:t>
-      </w:r>
-      <w:r>
-        <w:rPr>
-          <w:rFonts w:ascii="Times New Roman" w:hAnsi="Times New Roman"/>
-          <w:color w:val="000000"/>
-          <w:sz w:val="24"/>
-        </w:rPr>
-        <w:t xml:space="preserve"> </w:t>
-      </w:r>
-      <w:r>
-        <w:rPr>
-          <w:rFonts w:ascii="Times New Roman" w:hAnsi="Times New Roman"/>
-          <w:color w:val="000000"/>
-          <w:sz w:val="24"/>
-        </w:rPr>
-        <w:t>наших</w:t>
-      </w:r>
-      <w:r>
-        <w:rPr>
-          <w:rFonts w:ascii="Times New Roman" w:hAnsi="Times New Roman"/>
-          <w:color w:val="000000"/>
-          <w:sz w:val="24"/>
-        </w:rPr>
-        <w:t xml:space="preserve"> </w:t>
-      </w:r>
-      <w:r>
-        <w:rPr>
-          <w:rFonts w:ascii="Times New Roman" w:hAnsi="Times New Roman"/>
-          <w:color w:val="000000"/>
-          <w:sz w:val="24"/>
-        </w:rPr>
-        <w:t>–</w:t>
-      </w:r>
-      <w:r>
-        <w:rPr>
-          <w:rFonts w:ascii="Times New Roman" w:hAnsi="Times New Roman"/>
-          <w:color w:val="000000"/>
-          <w:sz w:val="24"/>
-        </w:rPr>
-        <w:t xml:space="preserve"> </w:t>
-      </w:r>
-      <w:r>
-        <w:rPr>
-          <w:rFonts w:ascii="Times New Roman" w:hAnsi="Times New Roman"/>
-          <w:color w:val="000000"/>
-          <w:sz w:val="24"/>
-        </w:rPr>
-        <w:t>і</w:t>
-      </w:r>
-      <w:r>
-        <w:rPr>
-          <w:rFonts w:ascii="Times New Roman" w:hAnsi="Times New Roman"/>
-          <w:color w:val="000000"/>
-          <w:sz w:val="24"/>
-        </w:rPr>
-        <w:t xml:space="preserve"> </w:t>
-      </w:r>
-      <w:r>
-        <w:rPr>
-          <w:rFonts w:ascii="Times New Roman" w:hAnsi="Times New Roman"/>
-          <w:color w:val="000000"/>
-          <w:sz w:val="24"/>
-        </w:rPr>
-        <w:t>Тобі</w:t>
-      </w:r>
-      <w:r>
-        <w:rPr>
-          <w:rFonts w:ascii="Times New Roman" w:hAnsi="Times New Roman"/>
-          <w:color w:val="000000"/>
-          <w:sz w:val="24"/>
-        </w:rPr>
-        <w:t xml:space="preserve"> </w:t>
-      </w:r>
-      <w:r>
-        <w:rPr>
-          <w:rFonts w:ascii="Times New Roman" w:hAnsi="Times New Roman"/>
-          <w:color w:val="000000"/>
-          <w:sz w:val="24"/>
-        </w:rPr>
-        <w:t>славу</w:t>
-      </w:r>
-      <w:r>
-        <w:rPr>
-          <w:rFonts w:ascii="Times New Roman" w:hAnsi="Times New Roman"/>
-          <w:color w:val="000000"/>
-          <w:sz w:val="24"/>
-        </w:rPr>
-        <w:t xml:space="preserve"> </w:t>
-      </w:r>
-      <w:r>
-        <w:rPr>
-          <w:rFonts w:ascii="Times New Roman" w:hAnsi="Times New Roman"/>
-          <w:color w:val="000000"/>
-          <w:sz w:val="24"/>
-        </w:rPr>
-        <w:t>возсилаємо,</w:t>
-      </w:r>
-      <w:r>
-        <w:rPr>
-          <w:rFonts w:ascii="Times New Roman" w:hAnsi="Times New Roman"/>
-          <w:color w:val="000000"/>
-          <w:sz w:val="24"/>
-        </w:rPr>
-        <w:t xml:space="preserve"> </w:t>
-      </w:r>
-      <w:r>
-        <w:rPr>
-          <w:rFonts w:ascii="Times New Roman" w:hAnsi="Times New Roman"/>
-          <w:color w:val="000000"/>
-          <w:sz w:val="24"/>
-        </w:rPr>
-        <w:t>Отцю,</w:t>
-      </w:r>
-      <w:r>
-        <w:rPr>
-          <w:rFonts w:ascii="Times New Roman" w:hAnsi="Times New Roman"/>
-          <w:color w:val="000000"/>
-          <w:sz w:val="24"/>
-        </w:rPr>
-        <w:t xml:space="preserve"> </w:t>
-      </w:r>
-      <w:r>
-        <w:rPr>
-          <w:rFonts w:ascii="Times New Roman" w:hAnsi="Times New Roman"/>
-          <w:color w:val="000000"/>
-          <w:sz w:val="24"/>
-        </w:rPr>
-        <w:t>і</w:t>
-      </w:r>
-      <w:r>
-        <w:rPr>
-          <w:rFonts w:ascii="Times New Roman" w:hAnsi="Times New Roman"/>
-          <w:color w:val="000000"/>
-          <w:sz w:val="24"/>
-        </w:rPr>
-        <w:t xml:space="preserve"> </w:t>
-      </w:r>
-      <w:r>
-        <w:rPr>
-          <w:rFonts w:ascii="Times New Roman" w:hAnsi="Times New Roman"/>
-          <w:color w:val="000000"/>
-          <w:sz w:val="24"/>
-        </w:rPr>
-        <w:t>Сину,</w:t>
-      </w:r>
-      <w:r>
-        <w:rPr>
-          <w:rFonts w:ascii="Times New Roman" w:hAnsi="Times New Roman"/>
-          <w:color w:val="000000"/>
-          <w:sz w:val="24"/>
-        </w:rPr>
-        <w:t xml:space="preserve"> </w:t>
-      </w:r>
-      <w:r>
-        <w:rPr>
-          <w:rFonts w:ascii="Times New Roman" w:hAnsi="Times New Roman"/>
-          <w:color w:val="000000"/>
-          <w:sz w:val="24"/>
-        </w:rPr>
-        <w:t>і</w:t>
-      </w:r>
-      <w:r>
-        <w:rPr>
-          <w:rFonts w:ascii="Times New Roman" w:hAnsi="Times New Roman"/>
-          <w:color w:val="000000"/>
-          <w:sz w:val="24"/>
-        </w:rPr>
-        <w:t xml:space="preserve"> </w:t>
-      </w:r>
-      <w:r>
-        <w:rPr>
-          <w:rFonts w:ascii="Times New Roman" w:hAnsi="Times New Roman"/>
-          <w:color w:val="000000"/>
-          <w:sz w:val="24"/>
-        </w:rPr>
-        <w:t>Святому</w:t>
-      </w:r>
-      <w:r>
-        <w:rPr>
-          <w:rFonts w:ascii="Times New Roman" w:hAnsi="Times New Roman"/>
-          <w:color w:val="000000"/>
-          <w:sz w:val="24"/>
-        </w:rPr>
-        <w:t xml:space="preserve"> </w:t>
-      </w:r>
-      <w:r>
-        <w:rPr>
-          <w:rFonts w:ascii="Times New Roman" w:hAnsi="Times New Roman"/>
-          <w:color w:val="000000"/>
-          <w:sz w:val="24"/>
-        </w:rPr>
-        <w:t>Духові</w:t>
-      </w:r>
-      <w:r>
-        <w:rPr>
-          <w:rFonts w:ascii="Times New Roman" w:hAnsi="Times New Roman"/>
-          <w:sz w:val="24"/>
-        </w:rPr>
-        <w:t>,</w:t>
-      </w:r>
-      <w:r>
-        <w:rPr>
-          <w:rFonts w:ascii="Times New Roman" w:hAnsi="Times New Roman"/>
-          <w:sz w:val="24"/>
-        </w:rPr>
-        <w:t xml:space="preserve"> </w:t>
-      </w:r>
-      <w:r>
-        <w:rPr>
-          <w:rFonts w:ascii="Times New Roman" w:hAnsi="Times New Roman"/>
-          <w:sz w:val="24"/>
-        </w:rPr>
-        <w:t>нині,</w:t>
-      </w:r>
-      <w:r>
-        <w:rPr>
-          <w:rFonts w:ascii="Times New Roman" w:hAnsi="Times New Roman"/>
-          <w:sz w:val="24"/>
-        </w:rPr>
-        <w:t xml:space="preserve"> </w:t>
-      </w:r>
-      <w:r>
-        <w:rPr>
-          <w:rFonts w:ascii="Times New Roman" w:hAnsi="Times New Roman"/>
-          <w:sz w:val="24"/>
-        </w:rPr>
-        <w:t>і</w:t>
-      </w:r>
-      <w:r>
-        <w:rPr>
-          <w:rFonts w:ascii="Times New Roman" w:hAnsi="Times New Roman"/>
-          <w:sz w:val="24"/>
-        </w:rPr>
-        <w:t xml:space="preserve"> </w:t>
-      </w:r>
-      <w:r>
-        <w:rPr>
-          <w:rFonts w:ascii="Times New Roman" w:hAnsi="Times New Roman"/>
-          <w:sz w:val="24"/>
-        </w:rPr>
-        <w:t>повсякчас,</w:t>
-      </w:r>
-      <w:r>
-        <w:rPr>
-          <w:rFonts w:ascii="Times New Roman" w:hAnsi="Times New Roman"/>
-          <w:sz w:val="24"/>
-        </w:rPr>
-        <w:t xml:space="preserve"> </w:t>
-      </w:r>
-      <w:r>
-        <w:rPr>
-          <w:rFonts w:ascii="Times New Roman" w:hAnsi="Times New Roman"/>
-          <w:sz w:val="24"/>
-        </w:rPr>
-        <w:t>і</w:t>
-      </w:r>
-      <w:r>
-        <w:rPr>
-          <w:rFonts w:ascii="Times New Roman" w:hAnsi="Times New Roman"/>
-          <w:sz w:val="24"/>
-        </w:rPr>
-        <w:t xml:space="preserve"> </w:t>
-      </w:r>
-      <w:r>
-        <w:rPr>
-          <w:rFonts w:ascii="Times New Roman" w:hAnsi="Times New Roman"/>
-          <w:sz w:val="24"/>
-        </w:rPr>
-        <w:t>на</w:t>
-      </w:r>
-      <w:r>
-        <w:rPr>
-          <w:rFonts w:ascii="Times New Roman" w:hAnsi="Times New Roman"/>
-          <w:sz w:val="24"/>
-        </w:rPr>
-        <w:t xml:space="preserve"> </w:t>
-      </w:r>
-      <w:r>
-        <w:rPr>
-          <w:rFonts w:ascii="Times New Roman" w:hAnsi="Times New Roman"/>
-          <w:sz w:val="24"/>
-        </w:rPr>
-        <w:t>віки</w:t>
-      </w:r>
-      <w:r>
-        <w:rPr>
-          <w:rFonts w:ascii="Times New Roman" w:hAnsi="Times New Roman"/>
-          <w:sz w:val="24"/>
-        </w:rPr>
-        <w:t xml:space="preserve"> </w:t>
-      </w:r>
-      <w:r>
-        <w:rPr>
-          <w:rFonts w:ascii="Times New Roman" w:hAnsi="Times New Roman"/>
-          <w:sz w:val="24"/>
-        </w:rPr>
-        <w:t>віків.</w:t>
+          <w:sz w:val="24"/>
+        </w:rPr>
+        <w:t xml:space="preserve"> Бо Ти цар миру і Спас душ наших – і Тобі славу возсилаємо, Отцю, і Сину, і Святому Духові, нині, і повсякчас, і на віки віків.</w:t>
       </w:r>
     </w:p>
     <w:p>
@@ -56539,7 +52968,7 @@
         <w:rPr>
           <w:rFonts w:ascii="Times New Roman" w:hAnsi="Times New Roman"/>
           <w:i/>
-          <w:color w:val="FF4400"/>
+          <w:color w:val="FF0000"/>
           <w:sz w:val="24"/>
         </w:rPr>
         <w:t>Священник:</w:t>
@@ -56547,326 +52976,9 @@
       <w:r>
         <w:rPr>
           <w:rFonts w:ascii="Times New Roman" w:hAnsi="Times New Roman"/>
-          <w:i/>
-          <w:color w:val="FF4400"/>
-          <w:sz w:val="24"/>
-        </w:rPr>
-        <w:t xml:space="preserve"> </w:t>
-      </w:r>
-      <w:r>
-        <w:rPr>
-          <w:rFonts w:ascii="Times New Roman" w:hAnsi="Times New Roman"/>
-          <w:sz w:val="24"/>
-        </w:rPr>
-        <w:t>Бо</w:t>
-      </w:r>
-      <w:r>
-        <w:rPr>
-          <w:rFonts w:ascii="Times New Roman" w:hAnsi="Times New Roman"/>
-          <w:sz w:val="24"/>
-        </w:rPr>
-        <w:t xml:space="preserve"> </w:t>
-      </w:r>
-      <w:r>
-        <w:rPr>
-          <w:rFonts w:ascii="Times New Roman" w:hAnsi="Times New Roman"/>
-          <w:sz w:val="24"/>
-        </w:rPr>
-        <w:t>милостивий</w:t>
-      </w:r>
-      <w:r>
-        <w:rPr>
-          <w:rFonts w:ascii="Times New Roman" w:hAnsi="Times New Roman"/>
-          <w:sz w:val="24"/>
-        </w:rPr>
-        <w:t xml:space="preserve"> </w:t>
-      </w:r>
-      <w:r>
-        <w:rPr>
-          <w:rFonts w:ascii="Times New Roman" w:hAnsi="Times New Roman"/>
-          <w:sz w:val="24"/>
-        </w:rPr>
-        <w:t>і</w:t>
-      </w:r>
-      <w:r>
-        <w:rPr>
-          <w:rFonts w:ascii="Times New Roman" w:hAnsi="Times New Roman"/>
-          <w:sz w:val="24"/>
-        </w:rPr>
-        <w:t xml:space="preserve"> </w:t>
-      </w:r>
-      <w:r>
-        <w:rPr>
-          <w:rFonts w:ascii="Times New Roman" w:hAnsi="Times New Roman"/>
-          <w:sz w:val="24"/>
-        </w:rPr>
-        <w:t>людинолюбний</w:t>
-      </w:r>
-      <w:r>
-        <w:rPr>
-          <w:rFonts w:ascii="Times New Roman" w:hAnsi="Times New Roman"/>
-          <w:sz w:val="24"/>
-        </w:rPr>
-        <w:t xml:space="preserve"> </w:t>
-      </w:r>
-      <w:r>
-        <w:rPr>
-          <w:rFonts w:ascii="Times New Roman" w:hAnsi="Times New Roman"/>
-          <w:sz w:val="24"/>
-        </w:rPr>
-        <w:t>Бог</w:t>
-      </w:r>
-      <w:r>
-        <w:rPr>
-          <w:rFonts w:ascii="Times New Roman" w:hAnsi="Times New Roman"/>
-          <w:sz w:val="24"/>
-        </w:rPr>
-        <w:t xml:space="preserve"> </w:t>
-      </w:r>
-      <w:r>
-        <w:rPr>
-          <w:rFonts w:ascii="Times New Roman" w:hAnsi="Times New Roman"/>
-          <w:sz w:val="24"/>
-        </w:rPr>
-        <w:t>єси,</w:t>
-      </w:r>
-      <w:r>
-        <w:rPr>
-          <w:rFonts w:ascii="Times New Roman" w:hAnsi="Times New Roman"/>
-          <w:sz w:val="24"/>
-        </w:rPr>
-        <w:t xml:space="preserve"> </w:t>
-      </w:r>
-      <w:r>
-        <w:rPr>
-          <w:rFonts w:ascii="Times New Roman" w:hAnsi="Times New Roman"/>
-          <w:sz w:val="24"/>
-        </w:rPr>
-        <w:t>і</w:t>
-      </w:r>
-      <w:r>
-        <w:rPr>
-          <w:rFonts w:ascii="Times New Roman" w:hAnsi="Times New Roman"/>
-          <w:sz w:val="24"/>
-        </w:rPr>
-        <w:t xml:space="preserve"> </w:t>
-      </w:r>
-      <w:r>
-        <w:rPr>
-          <w:rFonts w:ascii="Times New Roman" w:hAnsi="Times New Roman"/>
-          <w:sz w:val="24"/>
-        </w:rPr>
-        <w:t>Тобі</w:t>
-      </w:r>
-      <w:r>
-        <w:rPr>
-          <w:rFonts w:ascii="Times New Roman" w:hAnsi="Times New Roman"/>
-          <w:sz w:val="24"/>
-        </w:rPr>
-        <w:t xml:space="preserve"> </w:t>
-      </w:r>
-      <w:r>
-        <w:rPr>
-          <w:rFonts w:ascii="Times New Roman" w:hAnsi="Times New Roman"/>
-          <w:sz w:val="24"/>
-        </w:rPr>
-        <w:t>славу</w:t>
-      </w:r>
-      <w:r>
-        <w:rPr>
-          <w:rFonts w:ascii="Times New Roman" w:hAnsi="Times New Roman"/>
-          <w:sz w:val="24"/>
-        </w:rPr>
-        <w:t xml:space="preserve"> </w:t>
-      </w:r>
-      <w:r>
-        <w:rPr>
-          <w:rFonts w:ascii="Times New Roman" w:hAnsi="Times New Roman"/>
-          <w:sz w:val="24"/>
-        </w:rPr>
-        <w:t>возсилаємо,</w:t>
-      </w:r>
-      <w:r>
-        <w:rPr>
-          <w:rFonts w:ascii="Times New Roman" w:hAnsi="Times New Roman"/>
-          <w:sz w:val="24"/>
-        </w:rPr>
-        <w:t xml:space="preserve"> </w:t>
-      </w:r>
-      <w:r>
-        <w:rPr>
-          <w:rFonts w:ascii="Times New Roman" w:hAnsi="Times New Roman"/>
-          <w:sz w:val="24"/>
-        </w:rPr>
-        <w:t>Отцю,</w:t>
-      </w:r>
-      <w:r>
-        <w:rPr>
-          <w:rFonts w:ascii="Times New Roman" w:hAnsi="Times New Roman"/>
-          <w:sz w:val="24"/>
-        </w:rPr>
-        <w:t xml:space="preserve"> </w:t>
-      </w:r>
-      <w:r>
-        <w:rPr>
-          <w:rFonts w:ascii="Times New Roman" w:hAnsi="Times New Roman"/>
-          <w:sz w:val="24"/>
-        </w:rPr>
-        <w:t>і</w:t>
-      </w:r>
-      <w:r>
-        <w:rPr>
-          <w:rFonts w:ascii="Times New Roman" w:hAnsi="Times New Roman"/>
-          <w:sz w:val="24"/>
-        </w:rPr>
-        <w:t xml:space="preserve"> </w:t>
-      </w:r>
-      <w:r>
-        <w:rPr>
-          <w:rFonts w:ascii="Times New Roman" w:hAnsi="Times New Roman"/>
-          <w:sz w:val="24"/>
-        </w:rPr>
-        <w:t>Сину,</w:t>
-      </w:r>
-      <w:r>
-        <w:rPr>
-          <w:rFonts w:ascii="Times New Roman" w:hAnsi="Times New Roman"/>
-          <w:sz w:val="24"/>
-        </w:rPr>
-        <w:t xml:space="preserve"> </w:t>
-      </w:r>
-      <w:r>
-        <w:rPr>
-          <w:rFonts w:ascii="Times New Roman" w:hAnsi="Times New Roman"/>
-          <w:sz w:val="24"/>
-        </w:rPr>
-        <w:t>і</w:t>
-      </w:r>
-      <w:r>
-        <w:rPr>
-          <w:rFonts w:ascii="Times New Roman" w:hAnsi="Times New Roman"/>
-          <w:sz w:val="24"/>
-        </w:rPr>
-        <w:t xml:space="preserve"> </w:t>
-      </w:r>
-      <w:r>
-        <w:rPr>
-          <w:rFonts w:ascii="Times New Roman" w:hAnsi="Times New Roman"/>
-          <w:sz w:val="24"/>
-        </w:rPr>
-        <w:t>Святому</w:t>
-      </w:r>
-      <w:r>
-        <w:rPr>
-          <w:rFonts w:ascii="Times New Roman" w:hAnsi="Times New Roman"/>
-          <w:sz w:val="24"/>
-        </w:rPr>
-        <w:t xml:space="preserve"> </w:t>
-      </w:r>
-      <w:r>
-        <w:rPr>
-          <w:rFonts w:ascii="Times New Roman" w:hAnsi="Times New Roman"/>
-          <w:sz w:val="24"/>
-        </w:rPr>
-        <w:t>Духові,</w:t>
-      </w:r>
-      <w:r>
-        <w:rPr>
-          <w:rFonts w:ascii="Times New Roman" w:hAnsi="Times New Roman"/>
-          <w:sz w:val="24"/>
-        </w:rPr>
-        <w:t xml:space="preserve"> </w:t>
-      </w:r>
-      <w:r>
-        <w:rPr>
-          <w:rFonts w:ascii="Times New Roman" w:hAnsi="Times New Roman"/>
-          <w:sz w:val="24"/>
-        </w:rPr>
-        <w:t>нині,</w:t>
-      </w:r>
-      <w:r>
-        <w:rPr>
-          <w:rFonts w:ascii="Times New Roman" w:hAnsi="Times New Roman"/>
-          <w:sz w:val="24"/>
-        </w:rPr>
-        <w:t xml:space="preserve"> </w:t>
-      </w:r>
-      <w:r>
-        <w:rPr>
-          <w:rFonts w:ascii="Times New Roman" w:hAnsi="Times New Roman"/>
-          <w:sz w:val="24"/>
-        </w:rPr>
-        <w:t>і</w:t>
-      </w:r>
-      <w:r>
-        <w:rPr>
-          <w:rFonts w:ascii="Times New Roman" w:hAnsi="Times New Roman"/>
-          <w:sz w:val="24"/>
-        </w:rPr>
-        <w:t xml:space="preserve"> </w:t>
-      </w:r>
-      <w:r>
-        <w:rPr>
-          <w:rFonts w:ascii="Times New Roman" w:hAnsi="Times New Roman"/>
-          <w:sz w:val="24"/>
-        </w:rPr>
-        <w:t>повсякчас,</w:t>
-      </w:r>
-      <w:r>
-        <w:rPr>
-          <w:rFonts w:ascii="Times New Roman" w:hAnsi="Times New Roman"/>
-          <w:sz w:val="24"/>
-        </w:rPr>
-        <w:t xml:space="preserve"> </w:t>
-      </w:r>
-      <w:r>
-        <w:rPr>
-          <w:rFonts w:ascii="Times New Roman" w:hAnsi="Times New Roman"/>
-          <w:sz w:val="24"/>
-        </w:rPr>
-        <w:t>і</w:t>
-      </w:r>
-      <w:r>
-        <w:rPr>
-          <w:rFonts w:ascii="Times New Roman" w:hAnsi="Times New Roman"/>
-          <w:sz w:val="24"/>
-        </w:rPr>
-        <w:t xml:space="preserve"> </w:t>
-      </w:r>
-      <w:r>
-        <w:rPr>
-          <w:rFonts w:ascii="Times New Roman" w:hAnsi="Times New Roman"/>
-          <w:sz w:val="24"/>
-        </w:rPr>
-        <w:t>на</w:t>
-      </w:r>
-      <w:r>
-        <w:rPr>
-          <w:rFonts w:ascii="Times New Roman" w:hAnsi="Times New Roman"/>
-          <w:sz w:val="24"/>
-        </w:rPr>
-        <w:t xml:space="preserve"> </w:t>
-      </w:r>
-      <w:r>
-        <w:rPr>
-          <w:rFonts w:ascii="Times New Roman" w:hAnsi="Times New Roman"/>
-          <w:sz w:val="24"/>
-        </w:rPr>
-        <w:t>віки</w:t>
-      </w:r>
-      <w:r>
-        <w:rPr>
-          <w:rFonts w:ascii="Times New Roman" w:hAnsi="Times New Roman"/>
-          <w:sz w:val="24"/>
-        </w:rPr>
-        <w:t xml:space="preserve"> </w:t>
-      </w:r>
-      <w:r>
-        <w:rPr>
-          <w:rFonts w:ascii="Times New Roman" w:hAnsi="Times New Roman"/>
-          <w:sz w:val="24"/>
-        </w:rPr>
-        <w:t>віків.</w:t>
+          <w:sz w:val="24"/>
+        </w:rPr>
+        <w:t xml:space="preserve"> Бо милостивий і людинолюбний Бог єси, і Тобі славу возсилаємо, Отцю, і Сину, і Святому Духові, нині, і повсякчас, і на віки віків.</w:t>
       </w:r>
     </w:p>
     <w:p>
@@ -59349,7 +55461,7 @@
         <w:rPr>
           <w:rFonts w:ascii="Times New Roman" w:hAnsi="Times New Roman"/>
           <w:i/>
-          <w:color w:val="FF4400"/>
+          <w:color w:val="FF0000"/>
           <w:sz w:val="24"/>
         </w:rPr>
         <w:t>Священник:</w:t>
@@ -59357,435 +55469,9 @@
       <w:r>
         <w:rPr>
           <w:rFonts w:ascii="Times New Roman" w:hAnsi="Times New Roman"/>
-          <w:i/>
-          <w:color w:val="FF4400"/>
-          <w:sz w:val="24"/>
-        </w:rPr>
-        <w:t xml:space="preserve"> </w:t>
-      </w:r>
-      <w:r>
-        <w:rPr>
-          <w:rFonts w:ascii="Times New Roman" w:hAnsi="Times New Roman"/>
-          <w:color w:val="000000"/>
-          <w:sz w:val="24"/>
-        </w:rPr>
-        <w:t>Бо</w:t>
-      </w:r>
-      <w:r>
-        <w:rPr>
-          <w:rFonts w:ascii="Times New Roman" w:hAnsi="Times New Roman"/>
-          <w:color w:val="000000"/>
-          <w:sz w:val="24"/>
-        </w:rPr>
-        <w:t xml:space="preserve"> </w:t>
-      </w:r>
-      <w:r>
-        <w:rPr>
-          <w:rFonts w:ascii="Times New Roman" w:hAnsi="Times New Roman"/>
-          <w:color w:val="000000"/>
-          <w:sz w:val="24"/>
-        </w:rPr>
-        <w:t>до</w:t>
-      </w:r>
-      <w:r>
-        <w:rPr>
-          <w:rFonts w:ascii="Times New Roman" w:hAnsi="Times New Roman"/>
-          <w:color w:val="000000"/>
-          <w:sz w:val="24"/>
-        </w:rPr>
-        <w:t xml:space="preserve"> </w:t>
-      </w:r>
-      <w:r>
-        <w:rPr>
-          <w:rFonts w:ascii="Times New Roman" w:hAnsi="Times New Roman"/>
-          <w:color w:val="000000"/>
-          <w:sz w:val="24"/>
-        </w:rPr>
-        <w:t>Тебе</w:t>
-      </w:r>
-      <w:r>
-        <w:rPr>
-          <w:rFonts w:ascii="Times New Roman" w:hAnsi="Times New Roman"/>
-          <w:color w:val="000000"/>
-          <w:sz w:val="24"/>
-        </w:rPr>
-        <w:t xml:space="preserve"> </w:t>
-      </w:r>
-      <w:r>
-        <w:rPr>
-          <w:rFonts w:ascii="Times New Roman" w:hAnsi="Times New Roman"/>
-          <w:color w:val="000000"/>
-          <w:sz w:val="24"/>
-        </w:rPr>
-        <w:t>належить</w:t>
-      </w:r>
-      <w:r>
-        <w:rPr>
-          <w:rFonts w:ascii="Times New Roman" w:hAnsi="Times New Roman"/>
-          <w:color w:val="000000"/>
-          <w:sz w:val="24"/>
-        </w:rPr>
-        <w:t xml:space="preserve"> </w:t>
-      </w:r>
-      <w:r>
-        <w:rPr>
-          <w:rFonts w:ascii="Times New Roman" w:hAnsi="Times New Roman"/>
-          <w:color w:val="000000"/>
-          <w:sz w:val="24"/>
-        </w:rPr>
-        <w:t>милувати</w:t>
-      </w:r>
-      <w:r>
-        <w:rPr>
-          <w:rFonts w:ascii="Times New Roman" w:hAnsi="Times New Roman"/>
-          <w:color w:val="000000"/>
-          <w:sz w:val="24"/>
-        </w:rPr>
-        <w:t xml:space="preserve"> </w:t>
-      </w:r>
-      <w:r>
-        <w:rPr>
-          <w:rFonts w:ascii="Times New Roman" w:hAnsi="Times New Roman"/>
-          <w:color w:val="000000"/>
-          <w:sz w:val="24"/>
-        </w:rPr>
-        <w:t>і</w:t>
-      </w:r>
-      <w:r>
-        <w:rPr>
-          <w:rFonts w:ascii="Times New Roman" w:hAnsi="Times New Roman"/>
-          <w:color w:val="000000"/>
-          <w:sz w:val="24"/>
-        </w:rPr>
-        <w:t xml:space="preserve"> </w:t>
-      </w:r>
-      <w:r>
-        <w:rPr>
-          <w:rFonts w:ascii="Times New Roman" w:hAnsi="Times New Roman"/>
-          <w:color w:val="000000"/>
-          <w:sz w:val="24"/>
-        </w:rPr>
-        <w:t>спасати</w:t>
-      </w:r>
-      <w:r>
-        <w:rPr>
-          <w:rFonts w:ascii="Times New Roman" w:hAnsi="Times New Roman"/>
-          <w:color w:val="000000"/>
-          <w:sz w:val="24"/>
-        </w:rPr>
-        <w:t xml:space="preserve"> </w:t>
-      </w:r>
-      <w:r>
-        <w:rPr>
-          <w:rFonts w:ascii="Times New Roman" w:hAnsi="Times New Roman"/>
-          <w:color w:val="000000"/>
-          <w:sz w:val="24"/>
-        </w:rPr>
-        <w:t>нас,</w:t>
-      </w:r>
-      <w:r>
-        <w:rPr>
-          <w:rFonts w:ascii="Times New Roman" w:hAnsi="Times New Roman"/>
-          <w:color w:val="000000"/>
-          <w:sz w:val="24"/>
-        </w:rPr>
-        <w:t xml:space="preserve"> </w:t>
-      </w:r>
-      <w:r>
-        <w:rPr>
-          <w:rFonts w:ascii="Times New Roman" w:hAnsi="Times New Roman"/>
-          <w:color w:val="000000"/>
-          <w:sz w:val="24"/>
-        </w:rPr>
-        <w:t>Боже</w:t>
-      </w:r>
-      <w:r>
-        <w:rPr>
-          <w:rFonts w:ascii="Times New Roman" w:hAnsi="Times New Roman"/>
-          <w:color w:val="000000"/>
-          <w:sz w:val="24"/>
-        </w:rPr>
-        <w:t xml:space="preserve"> </w:t>
-      </w:r>
-      <w:r>
-        <w:rPr>
-          <w:rFonts w:ascii="Times New Roman" w:hAnsi="Times New Roman"/>
-          <w:color w:val="000000"/>
-          <w:sz w:val="24"/>
-        </w:rPr>
-        <w:t>наш,</w:t>
-      </w:r>
-      <w:r>
-        <w:rPr>
-          <w:rFonts w:ascii="Times New Roman" w:hAnsi="Times New Roman"/>
-          <w:color w:val="000000"/>
-          <w:sz w:val="24"/>
-        </w:rPr>
-        <w:t xml:space="preserve"> </w:t>
-      </w:r>
-      <w:r>
-        <w:rPr>
-          <w:rFonts w:ascii="Times New Roman" w:hAnsi="Times New Roman"/>
-          <w:color w:val="000000"/>
-          <w:sz w:val="24"/>
-        </w:rPr>
-        <w:t>і</w:t>
-      </w:r>
-      <w:r>
-        <w:rPr>
-          <w:rFonts w:ascii="Times New Roman" w:hAnsi="Times New Roman"/>
-          <w:color w:val="000000"/>
-          <w:sz w:val="24"/>
-        </w:rPr>
-        <w:t xml:space="preserve"> </w:t>
-      </w:r>
-      <w:r>
-        <w:rPr>
-          <w:rFonts w:ascii="Times New Roman" w:hAnsi="Times New Roman"/>
-          <w:color w:val="000000"/>
-          <w:sz w:val="24"/>
-        </w:rPr>
-        <w:t>Тобі</w:t>
-      </w:r>
-      <w:r>
-        <w:rPr>
-          <w:rFonts w:ascii="Times New Roman" w:hAnsi="Times New Roman"/>
-          <w:color w:val="000000"/>
-          <w:sz w:val="24"/>
-        </w:rPr>
-        <w:t xml:space="preserve"> </w:t>
-      </w:r>
-      <w:r>
-        <w:rPr>
-          <w:rFonts w:ascii="Times New Roman" w:hAnsi="Times New Roman"/>
-          <w:color w:val="000000"/>
-          <w:sz w:val="24"/>
-        </w:rPr>
-        <w:t>славу</w:t>
-      </w:r>
-      <w:r>
-        <w:rPr>
-          <w:rFonts w:ascii="Times New Roman" w:hAnsi="Times New Roman"/>
-          <w:color w:val="000000"/>
-          <w:sz w:val="24"/>
-        </w:rPr>
-        <w:t xml:space="preserve"> </w:t>
-      </w:r>
-      <w:r>
-        <w:rPr>
-          <w:rFonts w:ascii="Times New Roman" w:hAnsi="Times New Roman"/>
-          <w:color w:val="000000"/>
-          <w:sz w:val="24"/>
-        </w:rPr>
-        <w:t>віддаємо,</w:t>
-      </w:r>
-      <w:r>
-        <w:rPr>
-          <w:rFonts w:ascii="Times New Roman" w:hAnsi="Times New Roman"/>
-          <w:color w:val="000000"/>
-          <w:sz w:val="24"/>
-        </w:rPr>
-        <w:t xml:space="preserve"> </w:t>
-      </w:r>
-      <w:r>
-        <w:rPr>
-          <w:rFonts w:ascii="Times New Roman" w:hAnsi="Times New Roman"/>
-          <w:color w:val="000000"/>
-          <w:sz w:val="24"/>
-        </w:rPr>
-        <w:t>Отцю,</w:t>
-      </w:r>
-      <w:r>
-        <w:rPr>
-          <w:rFonts w:ascii="Times New Roman" w:hAnsi="Times New Roman"/>
-          <w:color w:val="000000"/>
-          <w:sz w:val="24"/>
-        </w:rPr>
-        <w:t xml:space="preserve"> </w:t>
-      </w:r>
-      <w:r>
-        <w:rPr>
-          <w:rFonts w:ascii="Times New Roman" w:hAnsi="Times New Roman"/>
-          <w:color w:val="000000"/>
-          <w:sz w:val="24"/>
-        </w:rPr>
-        <w:t>і</w:t>
-      </w:r>
-      <w:r>
-        <w:rPr>
-          <w:rFonts w:ascii="Times New Roman" w:hAnsi="Times New Roman"/>
-          <w:color w:val="000000"/>
-          <w:sz w:val="24"/>
-        </w:rPr>
-        <w:t xml:space="preserve"> </w:t>
-      </w:r>
-      <w:r>
-        <w:rPr>
-          <w:rFonts w:ascii="Times New Roman" w:hAnsi="Times New Roman"/>
-          <w:color w:val="000000"/>
-          <w:sz w:val="24"/>
-        </w:rPr>
-        <w:t>Сину,</w:t>
-      </w:r>
-      <w:r>
-        <w:rPr>
-          <w:rFonts w:ascii="Times New Roman" w:hAnsi="Times New Roman"/>
-          <w:color w:val="000000"/>
-          <w:sz w:val="24"/>
-        </w:rPr>
-        <w:t xml:space="preserve"> </w:t>
-      </w:r>
-      <w:r>
-        <w:rPr>
-          <w:rFonts w:ascii="Times New Roman" w:hAnsi="Times New Roman"/>
-          <w:color w:val="000000"/>
-          <w:sz w:val="24"/>
-        </w:rPr>
-        <w:t>і</w:t>
-      </w:r>
-      <w:r>
-        <w:rPr>
-          <w:rFonts w:ascii="Times New Roman" w:hAnsi="Times New Roman"/>
-          <w:color w:val="000000"/>
-          <w:sz w:val="24"/>
-        </w:rPr>
-        <w:t xml:space="preserve"> </w:t>
-      </w:r>
-      <w:r>
-        <w:rPr>
-          <w:rFonts w:ascii="Times New Roman" w:hAnsi="Times New Roman"/>
-          <w:color w:val="000000"/>
-          <w:sz w:val="24"/>
-        </w:rPr>
-        <w:t>Святому</w:t>
-      </w:r>
-      <w:r>
-        <w:rPr>
-          <w:rFonts w:ascii="Times New Roman" w:hAnsi="Times New Roman"/>
-          <w:color w:val="000000"/>
-          <w:sz w:val="24"/>
-        </w:rPr>
-        <w:t xml:space="preserve"> </w:t>
-      </w:r>
-      <w:r>
-        <w:rPr>
-          <w:rFonts w:ascii="Times New Roman" w:hAnsi="Times New Roman"/>
-          <w:color w:val="000000"/>
-          <w:sz w:val="24"/>
-        </w:rPr>
-        <w:t>Духові,</w:t>
-      </w:r>
-      <w:r>
-        <w:rPr>
-          <w:rFonts w:ascii="Times New Roman" w:hAnsi="Times New Roman"/>
-          <w:color w:val="000000"/>
-          <w:sz w:val="24"/>
-        </w:rPr>
-        <w:t xml:space="preserve"> </w:t>
-      </w:r>
-      <w:r>
-        <w:rPr>
-          <w:rFonts w:ascii="Times New Roman" w:hAnsi="Times New Roman"/>
-          <w:color w:val="000000"/>
-          <w:sz w:val="24"/>
-        </w:rPr>
-        <w:t>нині,</w:t>
-      </w:r>
-      <w:r>
-        <w:rPr>
-          <w:rFonts w:ascii="Times New Roman" w:hAnsi="Times New Roman"/>
-          <w:color w:val="000000"/>
-          <w:sz w:val="24"/>
-        </w:rPr>
-        <w:t xml:space="preserve"> </w:t>
-      </w:r>
-      <w:r>
-        <w:rPr>
-          <w:rFonts w:ascii="Times New Roman" w:hAnsi="Times New Roman"/>
-          <w:color w:val="000000"/>
-          <w:sz w:val="24"/>
-        </w:rPr>
-        <w:t>і</w:t>
-      </w:r>
-      <w:r>
-        <w:rPr>
-          <w:rFonts w:ascii="Times New Roman" w:hAnsi="Times New Roman"/>
-          <w:color w:val="000000"/>
-          <w:sz w:val="24"/>
-        </w:rPr>
-        <w:t xml:space="preserve"> </w:t>
-      </w:r>
-      <w:r>
-        <w:rPr>
-          <w:rFonts w:ascii="Times New Roman" w:hAnsi="Times New Roman"/>
-          <w:color w:val="000000"/>
-          <w:sz w:val="24"/>
-        </w:rPr>
-        <w:t>повсякчас,</w:t>
-      </w:r>
-      <w:r>
-        <w:rPr>
-          <w:rFonts w:ascii="Times New Roman" w:hAnsi="Times New Roman"/>
-          <w:color w:val="000000"/>
-          <w:sz w:val="24"/>
-        </w:rPr>
-        <w:t xml:space="preserve"> </w:t>
-      </w:r>
-      <w:r>
-        <w:rPr>
-          <w:rFonts w:ascii="Times New Roman" w:hAnsi="Times New Roman"/>
-          <w:color w:val="000000"/>
-          <w:sz w:val="24"/>
-        </w:rPr>
-        <w:t>і</w:t>
-      </w:r>
-      <w:r>
-        <w:rPr>
-          <w:rFonts w:ascii="Times New Roman" w:hAnsi="Times New Roman"/>
-          <w:color w:val="000000"/>
-          <w:sz w:val="24"/>
-        </w:rPr>
-        <w:t xml:space="preserve"> </w:t>
-      </w:r>
-      <w:r>
-        <w:rPr>
-          <w:rFonts w:ascii="Times New Roman" w:hAnsi="Times New Roman"/>
-          <w:color w:val="000000"/>
-          <w:sz w:val="24"/>
-        </w:rPr>
-        <w:t>на</w:t>
-      </w:r>
-      <w:r>
-        <w:rPr>
-          <w:rFonts w:ascii="Times New Roman" w:hAnsi="Times New Roman"/>
-          <w:color w:val="000000"/>
-          <w:sz w:val="24"/>
-        </w:rPr>
-        <w:t xml:space="preserve"> </w:t>
-      </w:r>
-      <w:r>
-        <w:rPr>
-          <w:rFonts w:ascii="Times New Roman" w:hAnsi="Times New Roman"/>
-          <w:color w:val="000000"/>
-          <w:sz w:val="24"/>
-        </w:rPr>
-        <w:t>віки</w:t>
-      </w:r>
-      <w:r>
-        <w:rPr>
-          <w:rFonts w:ascii="Times New Roman" w:hAnsi="Times New Roman"/>
-          <w:color w:val="000000"/>
-          <w:sz w:val="24"/>
-        </w:rPr>
-        <w:t xml:space="preserve"> </w:t>
-      </w:r>
-      <w:r>
-        <w:rPr>
-          <w:rFonts w:ascii="Times New Roman" w:hAnsi="Times New Roman"/>
-          <w:color w:val="000000"/>
-          <w:sz w:val="24"/>
-        </w:rPr>
-        <w:t>віків.</w:t>
+          <w:sz w:val="24"/>
+        </w:rPr>
+        <w:t xml:space="preserve"> Бо до Тебе належить милувати і спасати нас, Боже наш, і Тобі славу віддаємо, Отцю, і Сину, і Святому Духові, нині, і повсякчас, і на віки віків.</w:t>
       </w:r>
     </w:p>
     <w:p>
@@ -60156,48 +55842,38 @@
     <w:p>
       <w:pPr>
         <w:spacing w:after="120"/>
-        <w:jc w:val="both"/>
-        <w:rPr>
-          <w:rFonts w:ascii="Times New Roman" w:eastAsia="Times New Roman" w:hAnsi="Times New Roman" w:cs="Times New Roman"/>
-          <w:sz w:val="24"/>
-          <w:szCs w:val="24"/>
-        </w:rPr>
-      </w:pPr>
-      <w:r>
-        <w:rPr>
-          <w:rFonts w:ascii="Times New Roman" w:eastAsia="Times New Roman" w:hAnsi="Times New Roman" w:cs="Times New Roman"/>
-          <w:i/>
-          <w:color w:val="FF0000"/>
-          <w:sz w:val="24"/>
-          <w:szCs w:val="24"/>
-        </w:rPr>
-        <w:t>Свя</w:t>
-      </w:r>
-      <w:r>
-        <w:rPr>
-          <w:rFonts w:ascii="Times New Roman" w:eastAsia="Times New Roman" w:hAnsi="Times New Roman" w:cs="Times New Roman"/>
-          <w:i/>
-          <w:color w:val="FF0000"/>
-          <w:sz w:val="24"/>
-          <w:szCs w:val="24"/>
-        </w:rPr>
-        <w:t>щеник:</w:t>
-      </w:r>
-      <w:r>
-        <w:rPr>
-          <w:rFonts w:ascii="Times New Roman" w:eastAsia="Times New Roman" w:hAnsi="Times New Roman" w:cs="Times New Roman"/>
-          <w:sz w:val="24"/>
-          <w:szCs w:val="24"/>
-        </w:rPr>
-        <w:t xml:space="preserve"> Христос, істинний Бог наш, що прийняв по вісьмох днях законне обрізання спасіння нашого ради, молитвами пречистої своєї Матері і святого отця нашого Василія Великого, архиєпископа Кесарії Кападокійської, якого світлу пам'ять днесь урочисто святкуємо</w:t>
-      </w:r>
-      <w:r>
-        <w:rPr>
-          <w:rFonts w:ascii="Times New Roman" w:eastAsia="Times New Roman" w:hAnsi="Times New Roman" w:cs="Times New Roman"/>
-          <w:sz w:val="24"/>
-          <w:szCs w:val="24"/>
-        </w:rPr>
-        <w:t>, і всіх святих, помилує і спасе нас, як благий і людинолюбний.</w:t>
+      </w:pPr>
+      <w:r>
+        <w:rPr>
+          <w:rFonts w:ascii="Times New Roman" w:hAnsi="Times New Roman"/>
+          <w:i/>
+          <w:color w:val="FF0000"/>
+          <w:sz w:val="24"/>
+        </w:rPr>
+        <w:t>Священник:</w:t>
+      </w:r>
+      <w:r>
+        <w:rPr>
+          <w:rFonts w:ascii="Times New Roman" w:hAnsi="Times New Roman"/>
+          <w:sz w:val="24"/>
+        </w:rPr>
+        <w:t xml:space="preserve"> Христос, істинний Бог наш, що по вісьмох днях прийняв законне обрізання спасіння нашого ради - молитвами пречистої Cвоєї Матері, святих славних і всехвальних апостолів, святого отця нашого Василія Великого, архиєпископа Кесарії Кападокійської, якого сьогодні пам'ять світло звершуємо, і святого, </w:t>
+      </w:r>
+      <w:r>
+        <w:rPr>
+          <w:rFonts w:ascii="Times New Roman" w:hAnsi="Times New Roman"/>
+          <w:i/>
+          <w:color w:val="FF0000"/>
+          <w:sz w:val="24"/>
+        </w:rPr>
+        <w:t>якого є храм</w:t>
+      </w:r>
+      <w:r>
+        <w:rPr>
+          <w:rFonts w:ascii="Times New Roman" w:hAnsi="Times New Roman"/>
+          <w:sz w:val="24"/>
+        </w:rPr>
+        <w:t>, і всіх святих - помилує і спасе нас як благий і людинолюбний.</w:t>
       </w:r>
     </w:p>
     <w:p>

</xml_diff>